<commit_message>
Integrate initial survey plan into first AI prompt
</commit_message>
<xml_diff>
--- a/output/docx/2026_ECNU_PJ1_1_杨宇轩.docx
+++ b/output/docx/2026_ECNU_PJ1_1_杨宇轩.docx
@@ -1562,7 +1562,7 @@
         <w:ind w:firstLine="420"/>
       </w:pPr>
       <w:r>
-        <w:t>作业文件要求写明使用的工具、提示词、AI生成的代码、是否修改以及修改内容。下文先写我提出的基础方案，再按功能、页面、统计、部署和文档整理36项任务。每项记录具体要求、AI的初步实现、我发现的问题及对应修改。同一项任务中的多轮指令合并呈现，因此表格不等于完整的逐轮聊天记录。表格后列出部分实际代码，并说明哪些结果需要我继续检查和纠正。</w:t>
+        <w:t>作业文件要求写明使用的工具、提示词、AI生成的代码、是否修改以及修改内容。下文按开发顺序整理36项任务。第01项记录我最初提出的系统方案，后续条目记录功能细化、页面检查、统计、部署和文档整理。每项列出具体要求、AI的初步实现、我发现的问题及对应修改。同一项任务中的多轮指令合并呈现，因此表格不等于逐字的聊天记录。表格后列出部分实际代码，并说明哪些结果需要我继续检查和纠正。</w:t>
       </w:r>
     </w:p>
     <w:p>
@@ -1570,39 +1570,7 @@
         <w:ind w:firstLine="420"/>
       </w:pPr>
       <w:r>
-        <w:t>表中的“最终文件”是现在保留下来的代码或文档，不代表每一版初稿都还在。</w:t>
-      </w:r>
-    </w:p>
-    <w:p>
-      <w:pPr>
-        <w:pStyle w:val="Heading2"/>
-      </w:pPr>
-      <w:r>
-        <w:t>我提出的基础方案</w:t>
-      </w:r>
-    </w:p>
-    <w:p>
-      <w:pPr>
-        <w:ind w:firstLine="420"/>
-      </w:pPr>
-      <w:r>
-        <w:t>我希望做出一个能实际使用的在线问卷系统。用户注册、登录后，可以创建和管理自己的问卷，不能修改别人的问卷。新问卷先保存为草稿。创建者填写标题和说明，设置是否允许匿名、每个账号可以填写几次、何时截止，然后按顺序添加题目。题目包括单选、多选、文本填空和数字填空，选项和作答限制都由创建者设置，不能只用程序里写死的示例题。</w:t>
-      </w:r>
-    </w:p>
-    <w:p>
-      <w:pPr>
-        <w:ind w:firstLine="420"/>
-      </w:pPr>
-      <w:r>
-        <w:t>创建者设置题目和条件跳转，检查无误后发布问卷。填写者通过链接进入问卷，系统根据答案显示后续题目。提交时只检查实际需要回答的题目。提交成功后，填写者可以查看自己的答卷，创建者可以查看答卷以及整份问卷、每道题的统计结果。跳转规则必须由创建者自行设置，不能把演示问卷的跳法写死在程序中。账号、问卷、题目设置、跳转规则和答卷都要存入MongoDB，让创建、填写和查看使用同一份数据。</w:t>
-      </w:r>
-    </w:p>
-    <w:p>
-      <w:pPr>
-        <w:ind w:firstLine="420"/>
-      </w:pPr>
-      <w:r>
-        <w:t>以上是对最初要求的整理，并非当时逐字说出的一整段提示词。“选答”的标法、选项编号、提交前确认、长问卷定位、具名答卷查看、统计展示、JSON API和跨网络访问，都是后来根据页面和使用情况逐项提出或修改的。下表按开发顺序记录，没有把后来的改动写成最初的设计。</w:t>
+        <w:t>表中的“最终文件”是现在保留下来的代码或文档，不代表每一版初稿都还在。第01项根据最初的要求整理，并非当时逐字说出的一整段话。“选答”的标法、选项编号、提交前确认、长问卷定位、具名答卷查看、统计展示、JSON API和跨网络访问，都是后来根据页面和使用情况逐项提出或修改的，没有写进最初的提示词。</w:t>
       </w:r>
     </w:p>
     <w:p>
@@ -1636,7 +1604,7 @@
         <w:t>我的提示词：</w:t>
       </w:r>
       <w:r>
-        <w:t>请建立一个可以实际使用的在线问卷系统。用户注册、登录后，可以创建和管理自己的问卷，不能修改别人的问卷。新问卷先保存为草稿。创建者要能填写标题和说明，设置是否允许匿名、每个账号的填写次数和截止时间，再添加单选、多选、文本填空和数字填空题，并按答案设置条件跳转。检查无误后，创建者发布问卷，填写者通过链接作答。系统只检查需要回答的题目，保存提交的答卷，供填写者回看、创建者统计。账号、问卷、题目设置、跳转规则和答卷都要保存在MongoDB中，创建、填写、提交和查看必须真正连通。</w:t>
+        <w:t>请建立一个可以实际使用的在线问卷系统。用户注册、登录后，可以创建和管理自己的问卷，不能修改别人的问卷。新问卷先保存为草稿，创建者填写标题和说明，设置是否允许匿名、每个账号可以填写几次以及截止时间，再按顺序添加题目。题目包括单选、多选、文本填空和数字填空，选项和作答限制应由创建者设置，不能只用程序里写死的示例题。创建者还要能根据不同答案自行设置条件跳转，不能把演示问卷的跳法写死在程序中。检查无误后发布问卷，填写者通过分享链接进入，系统按答案显示后续题目。提交时只检查实际需要回答的题目，保存这次答卷。提交成功后，填写者可以回看自己的答卷，创建者可以查看答卷以及整份问卷、每道题的统计结果。账号、问卷、题目设置、跳转规则和答卷都要保存在MongoDB中，让创建、填写、提交和查看使用同一份数据，真正连通。</w:t>
       </w:r>
     </w:p>
     <w:p>

</xml_diff>

<commit_message>
Audit phase-one assignment and correct report evidence
</commit_message>
<xml_diff>
--- a/output/docx/2026_ECNU_PJ1_1_杨宇轩.docx
+++ b/output/docx/2026_ECNU_PJ1_1_杨宇轩.docx
@@ -45,44 +45,66 @@
           <w:rFonts w:ascii="SimSun" w:hAnsi="SimSun"/>
           <w:sz w:val="21"/>
         </w:rPr>
-        <w:t>作者：杨宇轩</w:t>
+        <w:t>代码仓库：https://github.com/ctasr/online-survey-system-phase1</w:t>
       </w:r>
     </w:p>
     <w:p>
-      <w:pPr>
-        <w:jc w:val="center"/>
-      </w:pPr>
-      <w:r>
-        <w:rPr>
-          <w:rFonts w:ascii="SimSun" w:hAnsi="SimSun"/>
-          <w:sz w:val="21"/>
-        </w:rPr>
-        <w:t>完成日期：2026年10月22日</w:t>
+      <w:r>
+        <w:br w:type="page"/>
       </w:r>
     </w:p>
     <w:p>
       <w:pPr>
-        <w:jc w:val="center"/>
-      </w:pPr>
-      <w:r>
-        <w:rPr>
-          <w:rFonts w:ascii="SimSun" w:hAnsi="SimSun"/>
-          <w:sz w:val="21"/>
-        </w:rPr>
-        <w:t>代码仓库：https://github.com/ctasr/online-survey-system-phase1</w:t>
+        <w:pStyle w:val="Heading1"/>
+      </w:pPr>
+      <w:r>
+        <w:t>一、项目目标</w:t>
       </w:r>
     </w:p>
     <w:p>
-      <w:r>
-        <w:br w:type="page"/>
+      <w:pPr>
+        <w:ind w:firstLine="420"/>
+      </w:pPr>
+      <w:r>
+        <w:t>本项目完成了第一阶段的在线问卷系统。用户注册、登录后，可以创建问卷、设置题目和跳转规则，再发布问卷供其他用户填写。创建者可以查看整份问卷和每道题的统计结果。代码、测试与结果分别保存在仓库的</w:t>
+      </w:r>
+      <w:r>
+        <w:rPr>
+          <w:rFonts w:ascii="Consolas" w:hAnsi="Consolas"/>
+          <w:sz w:val="18"/>
+        </w:rPr>
+        <w:t>app/</w:t>
+      </w:r>
+      <w:r>
+        <w:t>、</w:t>
+      </w:r>
+      <w:r>
+        <w:rPr>
+          <w:rFonts w:ascii="Consolas" w:hAnsi="Consolas"/>
+          <w:sz w:val="18"/>
+        </w:rPr>
+        <w:t>tests/</w:t>
+      </w:r>
+      <w:r>
+        <w:t>和</w:t>
+      </w:r>
+      <w:r>
+        <w:rPr>
+          <w:rFonts w:ascii="Consolas" w:hAnsi="Consolas"/>
+          <w:sz w:val="18"/>
+        </w:rPr>
+        <w:t>output/</w:t>
+      </w:r>
+      <w:r>
+        <w:t>中。第二阶段的需求变更尚未发布，本报告只写第一阶段已完成的内容。</w:t>
       </w:r>
     </w:p>
     <w:p>
       <w:pPr>
-        <w:pStyle w:val="Heading1"/>
-      </w:pPr>
-      <w:r>
-        <w:t>一、项目目标</w:t>
+        <w:ind w:firstLine="420"/>
+      </w:pPr>
+      <w:r>
+        <w:t>原任务包括项目目标、分阶段开发原则、技术限制、MongoDB设计、AI使用、测试与初始用户需求，不能只按“提交内容”检查。第一阶段在现有代码上完成设计、实现、测试和文档；第二阶段尚无变更说明，不能提前声称已经完成。届时须在现有结构上扩展，保留旧数据和主要功能，并记录设计、数据结构、程序及兼容性变化。仓库中按职责分开的集合、题目版本和共用的校验逻辑为后续修改提供基础，但第二阶段的兼容性仍须按新需求重新验证。</w:t>
       </w:r>
     </w:p>
     <w:p>
@@ -90,7 +112,7 @@
         <w:ind w:firstLine="420"/>
       </w:pPr>
       <w:r>
-        <w:t>本项目完成了第一阶段的在线问卷系统。用户注册、登录后，可以创建问卷、设置题目和跳转规则，再发布问卷供其他用户填写。创建者可以查看整份问卷和每道题的统计结果。代码、测试与结果分别保存在仓库的</w:t>
+        <w:t>代码在</w:t>
       </w:r>
       <w:r>
         <w:rPr>
@@ -100,123 +122,1654 @@
         <w:t>app/</w:t>
       </w:r>
       <w:r>
-        <w:t>、</w:t>
+        <w:t>目录，运行入口是</w:t>
       </w:r>
       <w:r>
         <w:rPr>
           <w:rFonts w:ascii="Consolas" w:hAnsi="Consolas"/>
           <w:sz w:val="18"/>
         </w:rPr>
-        <w:t>tests/</w:t>
-      </w:r>
-      <w:r>
-        <w:t>和</w:t>
+        <w:t>run.py</w:t>
+      </w:r>
+      <w:r>
+        <w:t>。依赖和配置方法见</w:t>
       </w:r>
       <w:r>
         <w:rPr>
           <w:rFonts w:ascii="Consolas" w:hAnsi="Consolas"/>
           <w:sz w:val="18"/>
         </w:rPr>
-        <w:t>output/</w:t>
-      </w:r>
-      <w:r>
-        <w:t>中。第二阶段的需求变更尚未发布，本报告只写第一阶段已完成的内容。</w:t>
+        <w:t>requirements.txt</w:t>
+      </w:r>
+      <w:r>
+        <w:t>、</w:t>
+      </w:r>
+      <w:r>
+        <w:rPr>
+          <w:rFonts w:ascii="Consolas" w:hAnsi="Consolas"/>
+          <w:sz w:val="18"/>
+        </w:rPr>
+        <w:t>.env.example</w:t>
+      </w:r>
+      <w:r>
+        <w:t>和</w:t>
+      </w:r>
+      <w:r>
+        <w:rPr>
+          <w:rFonts w:ascii="Consolas" w:hAnsi="Consolas"/>
+          <w:sz w:val="18"/>
+        </w:rPr>
+        <w:t>README.md</w:t>
+      </w:r>
+      <w:r>
+        <w:t>。公网演示地址是</w:t>
+      </w:r>
+      <w:r>
+        <w:rPr>
+          <w:rFonts w:ascii="Consolas" w:hAnsi="Consolas"/>
+          <w:sz w:val="18"/>
+        </w:rPr>
+        <w:t>https://119.28.27.184/</w:t>
+      </w:r>
+      <w:r>
+        <w:t>，问卷分享链接使用同一服务器的</w:t>
+      </w:r>
+      <w:r>
+        <w:rPr>
+          <w:rFonts w:ascii="Consolas" w:hAnsi="Consolas"/>
+          <w:sz w:val="18"/>
+        </w:rPr>
+        <w:t>/survey/&lt;slug&gt;</w:t>
+      </w:r>
+      <w:r>
+        <w:t>路径。填写者需要登录，问卷也必须处于可填写状态。本地地址</w:t>
+      </w:r>
+      <w:r>
+        <w:rPr>
+          <w:rFonts w:ascii="Consolas" w:hAnsi="Consolas"/>
+          <w:sz w:val="18"/>
+        </w:rPr>
+        <w:t>127.0.0.1</w:t>
+      </w:r>
+      <w:r>
+        <w:t>只供本机调试，不能发给外部用户。</w:t>
       </w:r>
     </w:p>
     <w:p>
       <w:pPr>
-        <w:ind w:firstLine="420"/>
-      </w:pPr>
-      <w:r>
-        <w:t>代码在</w:t>
-      </w:r>
-      <w:r>
-        <w:rPr>
-          <w:rFonts w:ascii="Consolas" w:hAnsi="Consolas"/>
-          <w:sz w:val="18"/>
-        </w:rPr>
-        <w:t>app/</w:t>
-      </w:r>
-      <w:r>
-        <w:t>目录，运行入口是</w:t>
-      </w:r>
-      <w:r>
-        <w:rPr>
-          <w:rFonts w:ascii="Consolas" w:hAnsi="Consolas"/>
-          <w:sz w:val="18"/>
-        </w:rPr>
-        <w:t>run.py</w:t>
-      </w:r>
-      <w:r>
-        <w:t>。依赖和配置方法见</w:t>
-      </w:r>
-      <w:r>
-        <w:rPr>
-          <w:rFonts w:ascii="Consolas" w:hAnsi="Consolas"/>
-          <w:sz w:val="18"/>
-        </w:rPr>
-        <w:t>requirements.txt</w:t>
-      </w:r>
-      <w:r>
-        <w:t>、</w:t>
-      </w:r>
-      <w:r>
-        <w:rPr>
-          <w:rFonts w:ascii="Consolas" w:hAnsi="Consolas"/>
-          <w:sz w:val="18"/>
-        </w:rPr>
-        <w:t>.env.example</w:t>
-      </w:r>
-      <w:r>
-        <w:t>和</w:t>
-      </w:r>
-      <w:r>
-        <w:rPr>
-          <w:rFonts w:ascii="Consolas" w:hAnsi="Consolas"/>
-          <w:sz w:val="18"/>
-        </w:rPr>
-        <w:t>README.md</w:t>
-      </w:r>
-      <w:r>
-        <w:t>。公网演示地址是</w:t>
-      </w:r>
-      <w:r>
-        <w:rPr>
-          <w:rFonts w:ascii="Consolas" w:hAnsi="Consolas"/>
-          <w:sz w:val="18"/>
-        </w:rPr>
-        <w:t>https://119.28.27.184/</w:t>
-      </w:r>
-      <w:r>
-        <w:t>，问卷分享链接使用同一服务器的</w:t>
-      </w:r>
-      <w:r>
-        <w:rPr>
-          <w:rFonts w:ascii="Consolas" w:hAnsi="Consolas"/>
-          <w:sz w:val="18"/>
-        </w:rPr>
-        <w:t>/survey/&lt;slug&gt;</w:t>
-      </w:r>
-      <w:r>
-        <w:t>路径。填写者需要登录，问卷也必须处于可填写状态。本地地址</w:t>
-      </w:r>
-      <w:r>
-        <w:rPr>
-          <w:rFonts w:ascii="Consolas" w:hAnsi="Consolas"/>
-          <w:sz w:val="18"/>
-        </w:rPr>
-        <w:t>127.0.0.1</w:t>
-      </w:r>
-      <w:r>
-        <w:t>只供本机调试，不能发给外部用户。</w:t>
+        <w:pStyle w:val="Heading1"/>
+      </w:pPr>
+      <w:r>
+        <w:t>二、系统设计</w:t>
       </w:r>
     </w:p>
     <w:p>
       <w:pPr>
-        <w:pStyle w:val="Heading1"/>
-      </w:pPr>
-      <w:r>
-        <w:t>二、系统设计</w:t>
+        <w:pStyle w:val="Heading2"/>
+      </w:pPr>
+      <w:r>
+        <w:t>原任务逐项核对</w:t>
+      </w:r>
+    </w:p>
+    <w:p>
+      <w:pPr>
+        <w:ind w:firstLine="420"/>
+      </w:pPr>
+      <w:r>
+        <w:t>以下把原文件前面的约束和“初始用户需求”与实际实现对应起来。“已实现”指本地代码与相应测试可核对，不等于公网每条路径都已重新验收。第二阶段的变更要求在发布前没有可实施的具体内容。</w:t>
+      </w:r>
+    </w:p>
+    <w:tbl>
+      <w:tblPr>
+        <w:tblW w:type="auto" w:w="0"/>
+        <w:jc w:val="center"/>
+        <w:tblLayout w:type="fixed"/>
+        <w:tblLook w:firstColumn="1" w:firstRow="1" w:lastColumn="0" w:lastRow="0" w:noHBand="0" w:noVBand="1" w:val="04A0"/>
+      </w:tblPr>
+      <w:tblGrid>
+        <w:gridCol w:w="2891"/>
+        <w:gridCol w:w="5896"/>
+      </w:tblGrid>
+      <w:tr>
+        <w:trPr>
+          <w:tblHeader w:val="true"/>
+        </w:trPr>
+        <w:tc>
+          <w:tcPr>
+            <w:tcW w:type="dxa" w:w="2891"/>
+            <w:vAlign w:val="center"/>
+            <w:tcMar>
+              <w:top w:w="75" w:type="dxa"/>
+              <w:start w:w="80" w:type="dxa"/>
+              <w:bottom w:w="75" w:type="dxa"/>
+              <w:end w:w="80" w:type="dxa"/>
+            </w:tcMar>
+            <w:tcBorders>
+              <w:bottom w:val="single" w:sz="7" w:color="9B9B9B"/>
+            </w:tcBorders>
+          </w:tcPr>
+          <w:p>
+            <w:pPr>
+              <w:pStyle w:val="TableText"/>
+            </w:pPr>
+            <w:r>
+              <w:rPr>
+                <w:b/>
+              </w:rPr>
+              <w:t>原文件要求</w:t>
+            </w:r>
+          </w:p>
+        </w:tc>
+        <w:tc>
+          <w:tcPr>
+            <w:tcW w:type="dxa" w:w="5896"/>
+            <w:vAlign w:val="center"/>
+            <w:tcMar>
+              <w:top w:w="75" w:type="dxa"/>
+              <w:start w:w="80" w:type="dxa"/>
+              <w:bottom w:w="75" w:type="dxa"/>
+              <w:end w:w="80" w:type="dxa"/>
+            </w:tcMar>
+            <w:tcBorders>
+              <w:bottom w:val="single" w:sz="7" w:color="9B9B9B"/>
+            </w:tcBorders>
+          </w:tcPr>
+          <w:p>
+            <w:pPr>
+              <w:pStyle w:val="TableText"/>
+            </w:pPr>
+            <w:r>
+              <w:rPr>
+                <w:b/>
+              </w:rPr>
+              <w:t>第一阶段实现与核对依据</w:t>
+            </w:r>
+          </w:p>
+        </w:tc>
+      </w:tr>
+      <w:tr>
+        <w:tc>
+          <w:tcPr>
+            <w:tcW w:type="dxa" w:w="2891"/>
+            <w:vAlign w:val="center"/>
+            <w:tcMar>
+              <w:top w:w="75" w:type="dxa"/>
+              <w:start w:w="80" w:type="dxa"/>
+              <w:bottom w:w="75" w:type="dxa"/>
+              <w:end w:w="80" w:type="dxa"/>
+            </w:tcMar>
+            <w:tcBorders>
+              <w:bottom w:val="single" w:sz="3" w:color="D7D7D7"/>
+            </w:tcBorders>
+          </w:tcPr>
+          <w:p>
+            <w:pPr>
+              <w:pStyle w:val="TableText"/>
+            </w:pPr>
+            <w:r>
+              <w:t>简化的在线问卷系统，注册用户创建、URL分发、其他用户填写、统计结果</w:t>
+            </w:r>
+          </w:p>
+        </w:tc>
+        <w:tc>
+          <w:tcPr>
+            <w:tcW w:type="dxa" w:w="5896"/>
+            <w:vAlign w:val="center"/>
+            <w:tcMar>
+              <w:top w:w="75" w:type="dxa"/>
+              <w:start w:w="80" w:type="dxa"/>
+              <w:bottom w:w="75" w:type="dxa"/>
+              <w:end w:w="80" w:type="dxa"/>
+            </w:tcMar>
+            <w:tcBorders>
+              <w:bottom w:val="single" w:sz="3" w:color="D7D7D7"/>
+            </w:tcBorders>
+          </w:tcPr>
+          <w:p>
+            <w:pPr>
+              <w:pStyle w:val="TableText"/>
+            </w:pPr>
+            <w:r>
+              <w:rPr>
+                <w:rFonts w:ascii="Consolas" w:hAnsi="Consolas"/>
+                <w:sz w:val="18"/>
+              </w:rPr>
+              <w:t>app/auth.py</w:t>
+            </w:r>
+            <w:r>
+              <w:t>、</w:t>
+            </w:r>
+            <w:r>
+              <w:rPr>
+                <w:rFonts w:ascii="Consolas" w:hAnsi="Consolas"/>
+                <w:sz w:val="18"/>
+              </w:rPr>
+              <w:t>app/surveys.py</w:t>
+            </w:r>
+            <w:r>
+              <w:t>、</w:t>
+            </w:r>
+            <w:r>
+              <w:rPr>
+                <w:rFonts w:ascii="Consolas" w:hAnsi="Consolas"/>
+                <w:sz w:val="18"/>
+              </w:rPr>
+              <w:t>app/statistics.py</w:t>
+            </w:r>
+            <w:r>
+              <w:t>，</w:t>
+            </w:r>
+            <w:r>
+              <w:rPr>
+                <w:rFonts w:ascii="Consolas" w:hAnsi="Consolas"/>
+                <w:sz w:val="18"/>
+              </w:rPr>
+              <w:t>tests/test_full_journey.py</w:t>
+            </w:r>
+            <w:r>
+              <w:t>覆盖完整流程。</w:t>
+            </w:r>
+          </w:p>
+        </w:tc>
+      </w:tr>
+      <w:tr>
+        <w:tc>
+          <w:tcPr>
+            <w:tcW w:type="dxa" w:w="2891"/>
+            <w:vAlign w:val="center"/>
+            <w:tcMar>
+              <w:top w:w="75" w:type="dxa"/>
+              <w:start w:w="80" w:type="dxa"/>
+              <w:bottom w:w="75" w:type="dxa"/>
+              <w:end w:w="80" w:type="dxa"/>
+            </w:tcMar>
+            <w:tcBorders>
+              <w:bottom w:val="single" w:sz="3" w:color="D7D7D7"/>
+            </w:tcBorders>
+          </w:tcPr>
+          <w:p>
+            <w:pPr>
+              <w:pStyle w:val="TableText"/>
+            </w:pPr>
+            <w:r>
+              <w:t>第一阶段须完成系统和数据库设计、前后端、必要测试、文档、完整报告</w:t>
+            </w:r>
+          </w:p>
+        </w:tc>
+        <w:tc>
+          <w:tcPr>
+            <w:tcW w:type="dxa" w:w="5896"/>
+            <w:vAlign w:val="center"/>
+            <w:tcMar>
+              <w:top w:w="75" w:type="dxa"/>
+              <w:start w:w="80" w:type="dxa"/>
+              <w:bottom w:w="75" w:type="dxa"/>
+              <w:end w:w="80" w:type="dxa"/>
+            </w:tcMar>
+            <w:tcBorders>
+              <w:bottom w:val="single" w:sz="3" w:color="D7D7D7"/>
+            </w:tcBorders>
+          </w:tcPr>
+          <w:p>
+            <w:pPr>
+              <w:pStyle w:val="TableText"/>
+            </w:pPr>
+            <w:r>
+              <w:rPr>
+                <w:rFonts w:ascii="Consolas" w:hAnsi="Consolas"/>
+                <w:sz w:val="18"/>
+              </w:rPr>
+              <w:t>app/</w:t>
+            </w:r>
+            <w:r>
+              <w:t>、</w:t>
+            </w:r>
+            <w:r>
+              <w:rPr>
+                <w:rFonts w:ascii="Consolas" w:hAnsi="Consolas"/>
+                <w:sz w:val="18"/>
+              </w:rPr>
+              <w:t>docs/系统与数据库设计.md</w:t>
+            </w:r>
+            <w:r>
+              <w:t>、</w:t>
+            </w:r>
+            <w:r>
+              <w:rPr>
+                <w:rFonts w:ascii="Consolas" w:hAnsi="Consolas"/>
+                <w:sz w:val="18"/>
+              </w:rPr>
+              <w:t>tests/</w:t>
+            </w:r>
+            <w:r>
+              <w:t>、</w:t>
+            </w:r>
+            <w:r>
+              <w:rPr>
+                <w:rFonts w:ascii="Consolas" w:hAnsi="Consolas"/>
+                <w:sz w:val="18"/>
+              </w:rPr>
+              <w:t>README.md</w:t>
+            </w:r>
+            <w:r>
+              <w:t>、本报告分别对应；第一阶段不是只交界面。</w:t>
+            </w:r>
+          </w:p>
+        </w:tc>
+      </w:tr>
+      <w:tr>
+        <w:tc>
+          <w:tcPr>
+            <w:tcW w:type="dxa" w:w="2891"/>
+            <w:vAlign w:val="center"/>
+            <w:tcMar>
+              <w:top w:w="75" w:type="dxa"/>
+              <w:start w:w="80" w:type="dxa"/>
+              <w:bottom w:w="75" w:type="dxa"/>
+              <w:end w:w="80" w:type="dxa"/>
+            </w:tcMar>
+            <w:tcBorders>
+              <w:bottom w:val="single" w:sz="3" w:color="D7D7D7"/>
+            </w:tcBorders>
+          </w:tcPr>
+          <w:p>
+            <w:pPr>
+              <w:pStyle w:val="TableText"/>
+            </w:pPr>
+            <w:r>
+              <w:t>第二阶段只能在第一阶段代码上扩展，保留核心功能和旧数据，解释兼容性</w:t>
+            </w:r>
+          </w:p>
+        </w:tc>
+        <w:tc>
+          <w:tcPr>
+            <w:tcW w:type="dxa" w:w="5896"/>
+            <w:vAlign w:val="center"/>
+            <w:tcMar>
+              <w:top w:w="75" w:type="dxa"/>
+              <w:start w:w="80" w:type="dxa"/>
+              <w:bottom w:w="75" w:type="dxa"/>
+              <w:end w:w="80" w:type="dxa"/>
+            </w:tcMar>
+            <w:tcBorders>
+              <w:bottom w:val="single" w:sz="3" w:color="D7D7D7"/>
+            </w:tcBorders>
+          </w:tcPr>
+          <w:p>
+            <w:pPr>
+              <w:pStyle w:val="TableText"/>
+            </w:pPr>
+            <w:r>
+              <w:t>第二阶段需求尚未发布，未作完成声明；现有代码保留题目历史与答卷快照，届时还需按实际新需求核对旧数据迁移与回归测试。</w:t>
+            </w:r>
+          </w:p>
+        </w:tc>
+      </w:tr>
+      <w:tr>
+        <w:tc>
+          <w:tcPr>
+            <w:tcW w:type="dxa" w:w="2891"/>
+            <w:vAlign w:val="center"/>
+            <w:tcMar>
+              <w:top w:w="75" w:type="dxa"/>
+              <w:start w:w="80" w:type="dxa"/>
+              <w:bottom w:w="75" w:type="dxa"/>
+              <w:end w:w="80" w:type="dxa"/>
+            </w:tcMar>
+            <w:tcBorders>
+              <w:bottom w:val="single" w:sz="3" w:color="D7D7D7"/>
+            </w:tcBorders>
+          </w:tcPr>
+          <w:p>
+            <w:pPr>
+              <w:pStyle w:val="TableText"/>
+            </w:pPr>
+            <w:r>
+              <w:t>所有业务数据使用MongoDB，不用关系数据库和现成问卷系统</w:t>
+            </w:r>
+          </w:p>
+        </w:tc>
+        <w:tc>
+          <w:tcPr>
+            <w:tcW w:type="dxa" w:w="5896"/>
+            <w:vAlign w:val="center"/>
+            <w:tcMar>
+              <w:top w:w="75" w:type="dxa"/>
+              <w:start w:w="80" w:type="dxa"/>
+              <w:bottom w:w="75" w:type="dxa"/>
+              <w:end w:w="80" w:type="dxa"/>
+            </w:tcMar>
+            <w:tcBorders>
+              <w:bottom w:val="single" w:sz="3" w:color="D7D7D7"/>
+            </w:tcBorders>
+          </w:tcPr>
+          <w:p>
+            <w:pPr>
+              <w:pStyle w:val="TableText"/>
+            </w:pPr>
+            <w:r>
+              <w:rPr>
+                <w:rFonts w:ascii="Consolas" w:hAnsi="Consolas"/>
+                <w:sz w:val="18"/>
+              </w:rPr>
+              <w:t>app/db.py</w:t>
+            </w:r>
+            <w:r>
+              <w:t>以PyMongo访问MongoDB，账号、问卷、答卷和草稿分四个集合；系统由Flask代码实现。测试使用独立MongoDB数据库。</w:t>
+            </w:r>
+          </w:p>
+        </w:tc>
+      </w:tr>
+      <w:tr>
+        <w:tc>
+          <w:tcPr>
+            <w:tcW w:type="dxa" w:w="2891"/>
+            <w:vAlign w:val="center"/>
+            <w:tcMar>
+              <w:top w:w="75" w:type="dxa"/>
+              <w:start w:w="80" w:type="dxa"/>
+              <w:bottom w:w="75" w:type="dxa"/>
+              <w:end w:w="80" w:type="dxa"/>
+            </w:tcMar>
+            <w:tcBorders>
+              <w:bottom w:val="single" w:sz="3" w:color="D7D7D7"/>
+            </w:tcBorders>
+          </w:tcPr>
+          <w:p>
+            <w:pPr>
+              <w:pStyle w:val="TableText"/>
+            </w:pPr>
+            <w:r>
+              <w:t>不把所有数据放进一个集合，审慎冗余，不把条件逻辑写死；解释MongoDB设计理由</w:t>
+            </w:r>
+          </w:p>
+        </w:tc>
+        <w:tc>
+          <w:tcPr>
+            <w:tcW w:type="dxa" w:w="5896"/>
+            <w:vAlign w:val="center"/>
+            <w:tcMar>
+              <w:top w:w="75" w:type="dxa"/>
+              <w:start w:w="80" w:type="dxa"/>
+              <w:bottom w:w="75" w:type="dxa"/>
+              <w:end w:w="80" w:type="dxa"/>
+            </w:tcMar>
+            <w:tcBorders>
+              <w:bottom w:val="single" w:sz="3" w:color="D7D7D7"/>
+            </w:tcBorders>
+          </w:tcPr>
+          <w:p>
+            <w:pPr>
+              <w:pStyle w:val="TableText"/>
+            </w:pPr>
+            <w:r>
+              <w:rPr>
+                <w:rFonts w:ascii="Consolas" w:hAnsi="Consolas"/>
+                <w:sz w:val="18"/>
+              </w:rPr>
+              <w:t>docs/系统与数据库设计.md</w:t>
+            </w:r>
+            <w:r>
+              <w:t>解释四个集合、问卷内嵌题目、答卷独立存储、快照和索引，以及为什么采用文档结构；跳转规则存于问卷文档。</w:t>
+            </w:r>
+          </w:p>
+        </w:tc>
+      </w:tr>
+      <w:tr>
+        <w:tc>
+          <w:tcPr>
+            <w:tcW w:type="dxa" w:w="2891"/>
+            <w:vAlign w:val="center"/>
+            <w:tcMar>
+              <w:top w:w="75" w:type="dxa"/>
+              <w:start w:w="80" w:type="dxa"/>
+              <w:bottom w:w="75" w:type="dxa"/>
+              <w:end w:w="80" w:type="dxa"/>
+            </w:tcMar>
+            <w:tcBorders>
+              <w:bottom w:val="single" w:sz="3" w:color="D7D7D7"/>
+            </w:tcBorders>
+          </w:tcPr>
+          <w:p>
+            <w:pPr>
+              <w:pStyle w:val="TableText"/>
+            </w:pPr>
+            <w:r>
+              <w:t>注册、登录、退出，账号有用户名、密码、注册时间</w:t>
+            </w:r>
+          </w:p>
+        </w:tc>
+        <w:tc>
+          <w:tcPr>
+            <w:tcW w:type="dxa" w:w="5896"/>
+            <w:vAlign w:val="center"/>
+            <w:tcMar>
+              <w:top w:w="75" w:type="dxa"/>
+              <w:start w:w="80" w:type="dxa"/>
+              <w:bottom w:w="75" w:type="dxa"/>
+              <w:end w:w="80" w:type="dxa"/>
+            </w:tcMar>
+            <w:tcBorders>
+              <w:bottom w:val="single" w:sz="3" w:color="D7D7D7"/>
+            </w:tcBorders>
+          </w:tcPr>
+          <w:p>
+            <w:pPr>
+              <w:pStyle w:val="TableText"/>
+            </w:pPr>
+            <w:r>
+              <w:rPr>
+                <w:rFonts w:ascii="Consolas" w:hAnsi="Consolas"/>
+                <w:sz w:val="18"/>
+              </w:rPr>
+              <w:t>app/auth.py</w:t>
+            </w:r>
+            <w:r>
+              <w:t>保存</w:t>
+            </w:r>
+            <w:r>
+              <w:rPr>
+                <w:rFonts w:ascii="Consolas" w:hAnsi="Consolas"/>
+                <w:sz w:val="18"/>
+              </w:rPr>
+              <w:t>username</w:t>
+            </w:r>
+            <w:r>
+              <w:t>、</w:t>
+            </w:r>
+            <w:r>
+              <w:rPr>
+                <w:rFonts w:ascii="Consolas" w:hAnsi="Consolas"/>
+                <w:sz w:val="18"/>
+              </w:rPr>
+              <w:t>password_hash</w:t>
+            </w:r>
+            <w:r>
+              <w:t>、</w:t>
+            </w:r>
+            <w:r>
+              <w:rPr>
+                <w:rFonts w:ascii="Consolas" w:hAnsi="Consolas"/>
+                <w:sz w:val="18"/>
+              </w:rPr>
+              <w:t>created_at</w:t>
+            </w:r>
+            <w:r>
+              <w:t>，不保存明文密码；</w:t>
+            </w:r>
+            <w:r>
+              <w:rPr>
+                <w:rFonts w:ascii="Consolas" w:hAnsi="Consolas"/>
+                <w:sz w:val="18"/>
+              </w:rPr>
+              <w:t>tests/test_auth.py</w:t>
+            </w:r>
+            <w:r>
+              <w:t>检查注册和登录。</w:t>
+            </w:r>
+          </w:p>
+        </w:tc>
+      </w:tr>
+      <w:tr>
+        <w:tc>
+          <w:tcPr>
+            <w:tcW w:type="dxa" w:w="2891"/>
+            <w:vAlign w:val="center"/>
+            <w:tcMar>
+              <w:top w:w="75" w:type="dxa"/>
+              <w:start w:w="80" w:type="dxa"/>
+              <w:bottom w:w="75" w:type="dxa"/>
+              <w:end w:w="80" w:type="dxa"/>
+            </w:tcMar>
+            <w:tcBorders>
+              <w:bottom w:val="single" w:sz="3" w:color="D7D7D7"/>
+            </w:tcBorders>
+          </w:tcPr>
+          <w:p>
+            <w:pPr>
+              <w:pStyle w:val="TableText"/>
+            </w:pPr>
+            <w:r>
+              <w:t>只能查看和管理自己创建的问卷，并查看自己的问卷统计</w:t>
+            </w:r>
+          </w:p>
+        </w:tc>
+        <w:tc>
+          <w:tcPr>
+            <w:tcW w:type="dxa" w:w="5896"/>
+            <w:vAlign w:val="center"/>
+            <w:tcMar>
+              <w:top w:w="75" w:type="dxa"/>
+              <w:start w:w="80" w:type="dxa"/>
+              <w:bottom w:w="75" w:type="dxa"/>
+              <w:end w:w="80" w:type="dxa"/>
+            </w:tcMar>
+            <w:tcBorders>
+              <w:bottom w:val="single" w:sz="3" w:color="D7D7D7"/>
+            </w:tcBorders>
+          </w:tcPr>
+          <w:p>
+            <w:pPr>
+              <w:pStyle w:val="TableText"/>
+            </w:pPr>
+            <w:r>
+              <w:rPr>
+                <w:rFonts w:ascii="Consolas" w:hAnsi="Consolas"/>
+                <w:sz w:val="18"/>
+              </w:rPr>
+              <w:t>app/surveys.py</w:t>
+            </w:r>
+            <w:r>
+              <w:t>的所有者检查、</w:t>
+            </w:r>
+            <w:r>
+              <w:rPr>
+                <w:rFonts w:ascii="Consolas" w:hAnsi="Consolas"/>
+                <w:sz w:val="18"/>
+              </w:rPr>
+              <w:t>app/api.py</w:t>
+            </w:r>
+            <w:r>
+              <w:t>的私有资源检查；</w:t>
+            </w:r>
+            <w:r>
+              <w:rPr>
+                <w:rFonts w:ascii="Consolas" w:hAnsi="Consolas"/>
+                <w:sz w:val="18"/>
+              </w:rPr>
+              <w:t>tests/test_surveys.py</w:t>
+            </w:r>
+            <w:r>
+              <w:t>和</w:t>
+            </w:r>
+            <w:r>
+              <w:rPr>
+                <w:rFonts w:ascii="Consolas" w:hAnsi="Consolas"/>
+                <w:sz w:val="18"/>
+              </w:rPr>
+              <w:t>tests/test_json_api.py</w:t>
+            </w:r>
+            <w:r>
+              <w:t>核对越权访问。</w:t>
+            </w:r>
+          </w:p>
+        </w:tc>
+      </w:tr>
+      <w:tr>
+        <w:tc>
+          <w:tcPr>
+            <w:tcW w:type="dxa" w:w="2891"/>
+            <w:vAlign w:val="center"/>
+            <w:tcMar>
+              <w:top w:w="75" w:type="dxa"/>
+              <w:start w:w="80" w:type="dxa"/>
+              <w:bottom w:w="75" w:type="dxa"/>
+              <w:end w:w="80" w:type="dxa"/>
+            </w:tcMar>
+            <w:tcBorders>
+              <w:bottom w:val="single" w:sz="3" w:color="D7D7D7"/>
+            </w:tcBorders>
+          </w:tcPr>
+          <w:p>
+            <w:pPr>
+              <w:pStyle w:val="TableText"/>
+            </w:pPr>
+            <w:r>
+              <w:t>问卷有标题、说明、是否允许匿名，能列表、发布、设截止时间、关闭并生成分享URL；填写者先登录</w:t>
+            </w:r>
+          </w:p>
+        </w:tc>
+        <w:tc>
+          <w:tcPr>
+            <w:tcW w:type="dxa" w:w="5896"/>
+            <w:vAlign w:val="center"/>
+            <w:tcMar>
+              <w:top w:w="75" w:type="dxa"/>
+              <w:start w:w="80" w:type="dxa"/>
+              <w:bottom w:w="75" w:type="dxa"/>
+              <w:end w:w="80" w:type="dxa"/>
+            </w:tcMar>
+            <w:tcBorders>
+              <w:bottom w:val="single" w:sz="3" w:color="D7D7D7"/>
+            </w:tcBorders>
+          </w:tcPr>
+          <w:p>
+            <w:pPr>
+              <w:pStyle w:val="TableText"/>
+            </w:pPr>
+            <w:r>
+              <w:rPr>
+                <w:rFonts w:ascii="Consolas" w:hAnsi="Consolas"/>
+                <w:sz w:val="18"/>
+              </w:rPr>
+              <w:t>app/surveys.py</w:t>
+            </w:r>
+            <w:r>
+              <w:t>管理状态及分享链接，</w:t>
+            </w:r>
+            <w:r>
+              <w:rPr>
+                <w:rFonts w:ascii="Consolas" w:hAnsi="Consolas"/>
+                <w:sz w:val="18"/>
+              </w:rPr>
+              <w:t>app/sharing.py</w:t>
+            </w:r>
+            <w:r>
+              <w:t>生成</w:t>
+            </w:r>
+            <w:r>
+              <w:rPr>
+                <w:rFonts w:ascii="Consolas" w:hAnsi="Consolas"/>
+                <w:sz w:val="18"/>
+              </w:rPr>
+              <w:t>/survey/&lt;slug&gt;</w:t>
+            </w:r>
+            <w:r>
+              <w:t>，网页登录要求见</w:t>
+            </w:r>
+            <w:r>
+              <w:rPr>
+                <w:rFonts w:ascii="Consolas" w:hAnsi="Consolas"/>
+                <w:sz w:val="18"/>
+              </w:rPr>
+              <w:t>tests/test_sharing.py</w:t>
+            </w:r>
+            <w:r>
+              <w:t>、</w:t>
+            </w:r>
+            <w:r>
+              <w:rPr>
+                <w:rFonts w:ascii="Consolas" w:hAnsi="Consolas"/>
+                <w:sz w:val="18"/>
+              </w:rPr>
+              <w:t>tests/test_surveys.py</w:t>
+            </w:r>
+            <w:r>
+              <w:t>。匿名只隐藏创建者所见身份，不免登录。</w:t>
+            </w:r>
+          </w:p>
+        </w:tc>
+      </w:tr>
+      <w:tr>
+        <w:tc>
+          <w:tcPr>
+            <w:tcW w:type="dxa" w:w="2891"/>
+            <w:vAlign w:val="center"/>
+            <w:tcMar>
+              <w:top w:w="75" w:type="dxa"/>
+              <w:start w:w="80" w:type="dxa"/>
+              <w:bottom w:w="75" w:type="dxa"/>
+              <w:end w:w="80" w:type="dxa"/>
+            </w:tcMar>
+            <w:tcBorders>
+              <w:bottom w:val="single" w:sz="3" w:color="D7D7D7"/>
+            </w:tcBorders>
+          </w:tcPr>
+          <w:p>
+            <w:pPr>
+              <w:pStyle w:val="TableText"/>
+            </w:pPr>
+            <w:r>
+              <w:t>一份问卷包含多题；单选可设选项和必答</w:t>
+            </w:r>
+          </w:p>
+        </w:tc>
+        <w:tc>
+          <w:tcPr>
+            <w:tcW w:type="dxa" w:w="5896"/>
+            <w:vAlign w:val="center"/>
+            <w:tcMar>
+              <w:top w:w="75" w:type="dxa"/>
+              <w:start w:w="80" w:type="dxa"/>
+              <w:bottom w:w="75" w:type="dxa"/>
+              <w:end w:w="80" w:type="dxa"/>
+            </w:tcMar>
+            <w:tcBorders>
+              <w:bottom w:val="single" w:sz="3" w:color="D7D7D7"/>
+            </w:tcBorders>
+          </w:tcPr>
+          <w:p>
+            <w:pPr>
+              <w:pStyle w:val="TableText"/>
+            </w:pPr>
+            <w:r>
+              <w:rPr>
+                <w:rFonts w:ascii="Consolas" w:hAnsi="Consolas"/>
+                <w:sz w:val="18"/>
+              </w:rPr>
+              <w:t>app/questions.py</w:t>
+            </w:r>
+            <w:r>
+              <w:t>构建及校验题目，</w:t>
+            </w:r>
+            <w:r>
+              <w:rPr>
+                <w:rFonts w:ascii="Consolas" w:hAnsi="Consolas"/>
+                <w:sz w:val="18"/>
+              </w:rPr>
+              <w:t>tests/test_questions.py</w:t>
+            </w:r>
+            <w:r>
+              <w:t>检查选项与必答。</w:t>
+            </w:r>
+          </w:p>
+        </w:tc>
+      </w:tr>
+      <w:tr>
+        <w:tc>
+          <w:tcPr>
+            <w:tcW w:type="dxa" w:w="2891"/>
+            <w:vAlign w:val="center"/>
+            <w:tcMar>
+              <w:top w:w="75" w:type="dxa"/>
+              <w:start w:w="80" w:type="dxa"/>
+              <w:bottom w:w="75" w:type="dxa"/>
+              <w:end w:w="80" w:type="dxa"/>
+            </w:tcMar>
+            <w:tcBorders>
+              <w:bottom w:val="single" w:sz="3" w:color="D7D7D7"/>
+            </w:tcBorders>
+          </w:tcPr>
+          <w:p>
+            <w:pPr>
+              <w:pStyle w:val="TableText"/>
+            </w:pPr>
+            <w:r>
+              <w:t>多选可限制至少、最多、恰好选择的数量</w:t>
+            </w:r>
+          </w:p>
+        </w:tc>
+        <w:tc>
+          <w:tcPr>
+            <w:tcW w:type="dxa" w:w="5896"/>
+            <w:vAlign w:val="center"/>
+            <w:tcMar>
+              <w:top w:w="75" w:type="dxa"/>
+              <w:start w:w="80" w:type="dxa"/>
+              <w:bottom w:w="75" w:type="dxa"/>
+              <w:end w:w="80" w:type="dxa"/>
+            </w:tcMar>
+            <w:tcBorders>
+              <w:bottom w:val="single" w:sz="3" w:color="D7D7D7"/>
+            </w:tcBorders>
+          </w:tcPr>
+          <w:p>
+            <w:pPr>
+              <w:pStyle w:val="TableText"/>
+            </w:pPr>
+            <w:r>
+              <w:rPr>
+                <w:rFonts w:ascii="Consolas" w:hAnsi="Consolas"/>
+                <w:sz w:val="18"/>
+              </w:rPr>
+              <w:t>app/questions.py</w:t>
+            </w:r>
+            <w:r>
+              <w:t>在服务端校验</w:t>
+            </w:r>
+            <w:r>
+              <w:rPr>
+                <w:rFonts w:ascii="Consolas" w:hAnsi="Consolas"/>
+                <w:sz w:val="18"/>
+              </w:rPr>
+              <w:t>min_select</w:t>
+            </w:r>
+            <w:r>
+              <w:t>、</w:t>
+            </w:r>
+            <w:r>
+              <w:rPr>
+                <w:rFonts w:ascii="Consolas" w:hAnsi="Consolas"/>
+                <w:sz w:val="18"/>
+              </w:rPr>
+              <w:t>max_select</w:t>
+            </w:r>
+            <w:r>
+              <w:t>、</w:t>
+            </w:r>
+            <w:r>
+              <w:rPr>
+                <w:rFonts w:ascii="Consolas" w:hAnsi="Consolas"/>
+                <w:sz w:val="18"/>
+              </w:rPr>
+              <w:t>exact_select</w:t>
+            </w:r>
+            <w:r>
+              <w:t>，</w:t>
+            </w:r>
+            <w:r>
+              <w:rPr>
+                <w:rFonts w:ascii="Consolas" w:hAnsi="Consolas"/>
+                <w:sz w:val="18"/>
+              </w:rPr>
+              <w:t>tests/test_questions.py</w:t>
+            </w:r>
+            <w:r>
+              <w:t>检查非法数量。</w:t>
+            </w:r>
+          </w:p>
+        </w:tc>
+      </w:tr>
+      <w:tr>
+        <w:tc>
+          <w:tcPr>
+            <w:tcW w:type="dxa" w:w="2891"/>
+            <w:vAlign w:val="center"/>
+            <w:tcMar>
+              <w:top w:w="75" w:type="dxa"/>
+              <w:start w:w="80" w:type="dxa"/>
+              <w:bottom w:w="75" w:type="dxa"/>
+              <w:end w:w="80" w:type="dxa"/>
+            </w:tcMar>
+            <w:tcBorders>
+              <w:bottom w:val="single" w:sz="3" w:color="D7D7D7"/>
+            </w:tcBorders>
+          </w:tcPr>
+          <w:p>
+            <w:pPr>
+              <w:pStyle w:val="TableText"/>
+            </w:pPr>
+            <w:r>
+              <w:t>文本题可限最少和最多字数；数字题可限最小值、最大值和整数</w:t>
+            </w:r>
+          </w:p>
+        </w:tc>
+        <w:tc>
+          <w:tcPr>
+            <w:tcW w:type="dxa" w:w="5896"/>
+            <w:vAlign w:val="center"/>
+            <w:tcMar>
+              <w:top w:w="75" w:type="dxa"/>
+              <w:start w:w="80" w:type="dxa"/>
+              <w:bottom w:w="75" w:type="dxa"/>
+              <w:end w:w="80" w:type="dxa"/>
+            </w:tcMar>
+            <w:tcBorders>
+              <w:bottom w:val="single" w:sz="3" w:color="D7D7D7"/>
+            </w:tcBorders>
+          </w:tcPr>
+          <w:p>
+            <w:pPr>
+              <w:pStyle w:val="TableText"/>
+            </w:pPr>
+            <w:r>
+              <w:rPr>
+                <w:rFonts w:ascii="Consolas" w:hAnsi="Consolas"/>
+                <w:sz w:val="18"/>
+              </w:rPr>
+              <w:t>app/questions.py</w:t>
+            </w:r>
+            <w:r>
+              <w:t>检查文本长度、数字范围和整数；相关合法与非法输入见</w:t>
+            </w:r>
+            <w:r>
+              <w:rPr>
+                <w:rFonts w:ascii="Consolas" w:hAnsi="Consolas"/>
+                <w:sz w:val="18"/>
+              </w:rPr>
+              <w:t>tests/test_questions.py</w:t>
+            </w:r>
+            <w:r>
+              <w:t>、</w:t>
+            </w:r>
+            <w:r>
+              <w:rPr>
+                <w:rFonts w:ascii="Consolas" w:hAnsi="Consolas"/>
+                <w:sz w:val="18"/>
+              </w:rPr>
+              <w:t>tests/test_submissions.py</w:t>
+            </w:r>
+            <w:r>
+              <w:t>。</w:t>
+            </w:r>
+          </w:p>
+        </w:tc>
+      </w:tr>
+      <w:tr>
+        <w:tc>
+          <w:tcPr>
+            <w:tcW w:type="dxa" w:w="2891"/>
+            <w:vAlign w:val="center"/>
+            <w:tcMar>
+              <w:top w:w="75" w:type="dxa"/>
+              <w:start w:w="80" w:type="dxa"/>
+              <w:bottom w:w="75" w:type="dxa"/>
+              <w:end w:w="80" w:type="dxa"/>
+            </w:tcMar>
+            <w:tcBorders>
+              <w:bottom w:val="single" w:sz="3" w:color="D7D7D7"/>
+            </w:tcBorders>
+          </w:tcPr>
+          <w:p>
+            <w:pPr>
+              <w:pStyle w:val="TableText"/>
+            </w:pPr>
+            <w:r>
+              <w:t>单选、多选、数字题由创建者配置条件跳转，填写时按答案自动进入后续题</w:t>
+            </w:r>
+          </w:p>
+        </w:tc>
+        <w:tc>
+          <w:tcPr>
+            <w:tcW w:type="dxa" w:w="5896"/>
+            <w:vAlign w:val="center"/>
+            <w:tcMar>
+              <w:top w:w="75" w:type="dxa"/>
+              <w:start w:w="80" w:type="dxa"/>
+              <w:bottom w:w="75" w:type="dxa"/>
+              <w:end w:w="80" w:type="dxa"/>
+            </w:tcMar>
+            <w:tcBorders>
+              <w:bottom w:val="single" w:sz="3" w:color="D7D7D7"/>
+            </w:tcBorders>
+          </w:tcPr>
+          <w:p>
+            <w:pPr>
+              <w:pStyle w:val="TableText"/>
+            </w:pPr>
+            <w:r>
+              <w:rPr>
+                <w:rFonts w:ascii="Consolas" w:hAnsi="Consolas"/>
+                <w:sz w:val="18"/>
+              </w:rPr>
+              <w:t>app/jumps.py</w:t>
+            </w:r>
+            <w:r>
+              <w:t>读问卷中规则，</w:t>
+            </w:r>
+            <w:r>
+              <w:rPr>
+                <w:rFonts w:ascii="Consolas" w:hAnsi="Consolas"/>
+                <w:sz w:val="18"/>
+              </w:rPr>
+              <w:t>app/surveys.py</w:t>
+            </w:r>
+            <w:r>
+              <w:t>重算实际路径；</w:t>
+            </w:r>
+            <w:r>
+              <w:rPr>
+                <w:rFonts w:ascii="Consolas" w:hAnsi="Consolas"/>
+                <w:sz w:val="18"/>
+              </w:rPr>
+              <w:t>tests/test_jumps.py</w:t>
+            </w:r>
+            <w:r>
+              <w:t>、</w:t>
+            </w:r>
+            <w:r>
+              <w:rPr>
+                <w:rFonts w:ascii="Consolas" w:hAnsi="Consolas"/>
+                <w:sz w:val="18"/>
+              </w:rPr>
+              <w:t>tests/test_submissions.py</w:t>
+            </w:r>
+            <w:r>
+              <w:t>验证跳转和跳过题。</w:t>
+            </w:r>
+          </w:p>
+        </w:tc>
+      </w:tr>
+      <w:tr>
+        <w:tc>
+          <w:tcPr>
+            <w:tcW w:type="dxa" w:w="2891"/>
+            <w:vAlign w:val="center"/>
+            <w:tcMar>
+              <w:top w:w="75" w:type="dxa"/>
+              <w:start w:w="80" w:type="dxa"/>
+              <w:bottom w:w="75" w:type="dxa"/>
+              <w:end w:w="80" w:type="dxa"/>
+            </w:tcMar>
+            <w:tcBorders>
+              <w:bottom w:val="single" w:sz="3" w:color="D7D7D7"/>
+            </w:tcBorders>
+          </w:tcPr>
+          <w:p>
+            <w:pPr>
+              <w:pStyle w:val="TableText"/>
+            </w:pPr>
+            <w:r>
+              <w:t>按题作答、错误提示、提交并保存每次填写；多人可同时填写</w:t>
+            </w:r>
+          </w:p>
+        </w:tc>
+        <w:tc>
+          <w:tcPr>
+            <w:tcW w:type="dxa" w:w="5896"/>
+            <w:vAlign w:val="center"/>
+            <w:tcMar>
+              <w:top w:w="75" w:type="dxa"/>
+              <w:start w:w="80" w:type="dxa"/>
+              <w:bottom w:w="75" w:type="dxa"/>
+              <w:end w:w="80" w:type="dxa"/>
+            </w:tcMar>
+            <w:tcBorders>
+              <w:bottom w:val="single" w:sz="3" w:color="D7D7D7"/>
+            </w:tcBorders>
+          </w:tcPr>
+          <w:p>
+            <w:pPr>
+              <w:pStyle w:val="TableText"/>
+            </w:pPr>
+            <w:r>
+              <w:rPr>
+                <w:rFonts w:ascii="Consolas" w:hAnsi="Consolas"/>
+                <w:sz w:val="18"/>
+              </w:rPr>
+              <w:t>app/surveys.py</w:t>
+            </w:r>
+            <w:r>
+              <w:t>保存独立答卷，草稿存</w:t>
+            </w:r>
+            <w:r>
+              <w:rPr>
+                <w:rFonts w:ascii="Consolas" w:hAnsi="Consolas"/>
+                <w:sz w:val="18"/>
+              </w:rPr>
+              <w:t>response_drafts</w:t>
+            </w:r>
+            <w:r>
+              <w:t>，服务端再次校验；</w:t>
+            </w:r>
+            <w:r>
+              <w:rPr>
+                <w:rFonts w:ascii="Consolas" w:hAnsi="Consolas"/>
+                <w:sz w:val="18"/>
+              </w:rPr>
+              <w:t>tests/test_submissions.py</w:t>
+            </w:r>
+            <w:r>
+              <w:t>使用并发线程检查提交限制。</w:t>
+            </w:r>
+          </w:p>
+        </w:tc>
+      </w:tr>
+      <w:tr>
+        <w:tc>
+          <w:tcPr>
+            <w:tcW w:type="dxa" w:w="2891"/>
+            <w:vAlign w:val="center"/>
+            <w:tcMar>
+              <w:top w:w="75" w:type="dxa"/>
+              <w:start w:w="80" w:type="dxa"/>
+              <w:bottom w:w="75" w:type="dxa"/>
+              <w:end w:w="80" w:type="dxa"/>
+            </w:tcMar>
+            <w:tcBorders>
+              <w:bottom w:val="single" w:sz="3" w:color="D7D7D7"/>
+            </w:tcBorders>
+          </w:tcPr>
+          <w:p>
+            <w:pPr>
+              <w:pStyle w:val="TableText"/>
+            </w:pPr>
+            <w:r>
+              <w:t>允许匿名填写，同一人可在问卷允许时多次填写</w:t>
+            </w:r>
+          </w:p>
+        </w:tc>
+        <w:tc>
+          <w:tcPr>
+            <w:tcW w:type="dxa" w:w="5896"/>
+            <w:vAlign w:val="center"/>
+            <w:tcMar>
+              <w:top w:w="75" w:type="dxa"/>
+              <w:start w:w="80" w:type="dxa"/>
+              <w:bottom w:w="75" w:type="dxa"/>
+              <w:end w:w="80" w:type="dxa"/>
+            </w:tcMar>
+            <w:tcBorders>
+              <w:bottom w:val="single" w:sz="3" w:color="D7D7D7"/>
+            </w:tcBorders>
+          </w:tcPr>
+          <w:p>
+            <w:pPr>
+              <w:pStyle w:val="TableText"/>
+            </w:pPr>
+            <w:r>
+              <w:rPr>
+                <w:rFonts w:ascii="Consolas" w:hAnsi="Consolas"/>
+                <w:sz w:val="18"/>
+              </w:rPr>
+              <w:t>app/surveys.py</w:t>
+            </w:r>
+            <w:r>
+              <w:t>和</w:t>
+            </w:r>
+            <w:r>
+              <w:rPr>
+                <w:rFonts w:ascii="Consolas" w:hAnsi="Consolas"/>
+                <w:sz w:val="18"/>
+              </w:rPr>
+              <w:t>app/api.py</w:t>
+            </w:r>
+            <w:r>
+              <w:t>实现匿名/具名与重复策略；</w:t>
+            </w:r>
+            <w:r>
+              <w:rPr>
+                <w:rFonts w:ascii="Consolas" w:hAnsi="Consolas"/>
+                <w:sz w:val="18"/>
+              </w:rPr>
+              <w:t>tests/test_submissions.py</w:t>
+            </w:r>
+            <w:r>
+              <w:t>、</w:t>
+            </w:r>
+            <w:r>
+              <w:rPr>
+                <w:rFonts w:ascii="Consolas" w:hAnsi="Consolas"/>
+                <w:sz w:val="18"/>
+              </w:rPr>
+              <w:t>tests/test_json_api.py</w:t>
+            </w:r>
+            <w:r>
+              <w:t>验证。</w:t>
+            </w:r>
+          </w:p>
+        </w:tc>
+      </w:tr>
+      <w:tr>
+        <w:tc>
+          <w:tcPr>
+            <w:tcW w:type="dxa" w:w="2891"/>
+            <w:vAlign w:val="center"/>
+            <w:tcMar>
+              <w:top w:w="75" w:type="dxa"/>
+              <w:start w:w="80" w:type="dxa"/>
+              <w:bottom w:w="75" w:type="dxa"/>
+              <w:end w:w="80" w:type="dxa"/>
+            </w:tcMar>
+            <w:tcBorders>
+              <w:bottom w:val="single" w:sz="3" w:color="D7D7D7"/>
+            </w:tcBorders>
+          </w:tcPr>
+          <w:p>
+            <w:pPr>
+              <w:pStyle w:val="TableText"/>
+            </w:pPr>
+            <w:r>
+              <w:t>单选统计每项人数与总回答数，多选统计各项次数</w:t>
+            </w:r>
+          </w:p>
+        </w:tc>
+        <w:tc>
+          <w:tcPr>
+            <w:tcW w:type="dxa" w:w="5896"/>
+            <w:vAlign w:val="center"/>
+            <w:tcMar>
+              <w:top w:w="75" w:type="dxa"/>
+              <w:start w:w="80" w:type="dxa"/>
+              <w:bottom w:w="75" w:type="dxa"/>
+              <w:end w:w="80" w:type="dxa"/>
+            </w:tcMar>
+            <w:tcBorders>
+              <w:bottom w:val="single" w:sz="3" w:color="D7D7D7"/>
+            </w:tcBorders>
+          </w:tcPr>
+          <w:p>
+            <w:pPr>
+              <w:pStyle w:val="TableText"/>
+            </w:pPr>
+            <w:r>
+              <w:rPr>
+                <w:rFonts w:ascii="Consolas" w:hAnsi="Consolas"/>
+                <w:sz w:val="18"/>
+              </w:rPr>
+              <w:t>app/statistics.py</w:t>
+            </w:r>
+            <w:r>
+              <w:t>计算</w:t>
+            </w:r>
+            <w:r>
+              <w:rPr>
+                <w:rFonts w:ascii="Consolas" w:hAnsi="Consolas"/>
+                <w:sz w:val="18"/>
+              </w:rPr>
+              <w:t>answered_count</w:t>
+            </w:r>
+            <w:r>
+              <w:t>和</w:t>
+            </w:r>
+            <w:r>
+              <w:rPr>
+                <w:rFonts w:ascii="Consolas" w:hAnsi="Consolas"/>
+                <w:sz w:val="18"/>
+              </w:rPr>
+              <w:t>option_counts</w:t>
+            </w:r>
+            <w:r>
+              <w:t>，</w:t>
+            </w:r>
+            <w:r>
+              <w:rPr>
+                <w:rFonts w:ascii="Consolas" w:hAnsi="Consolas"/>
+                <w:sz w:val="18"/>
+              </w:rPr>
+              <w:t>tests/test_statistics.py</w:t>
+            </w:r>
+            <w:r>
+              <w:t>和</w:t>
+            </w:r>
+            <w:r>
+              <w:rPr>
+                <w:rFonts w:ascii="Consolas" w:hAnsi="Consolas"/>
+                <w:sz w:val="18"/>
+              </w:rPr>
+              <w:t>tests/test_json_api.py</w:t>
+            </w:r>
+            <w:r>
+              <w:t>核对结果。</w:t>
+            </w:r>
+          </w:p>
+        </w:tc>
+      </w:tr>
+      <w:tr>
+        <w:tc>
+          <w:tcPr>
+            <w:tcW w:type="dxa" w:w="2891"/>
+            <w:vAlign w:val="center"/>
+            <w:tcMar>
+              <w:top w:w="75" w:type="dxa"/>
+              <w:start w:w="80" w:type="dxa"/>
+              <w:bottom w:w="75" w:type="dxa"/>
+              <w:end w:w="80" w:type="dxa"/>
+            </w:tcMar>
+            <w:tcBorders>
+              <w:bottom w:val="single" w:sz="3" w:color="D7D7D7"/>
+            </w:tcBorders>
+          </w:tcPr>
+          <w:p>
+            <w:pPr>
+              <w:pStyle w:val="TableText"/>
+            </w:pPr>
+            <w:r>
+              <w:t>文本可查看全部填写内容，数字可查看平均值；整卷及单题统计根据答卷自动生成</w:t>
+            </w:r>
+          </w:p>
+        </w:tc>
+        <w:tc>
+          <w:tcPr>
+            <w:tcW w:type="dxa" w:w="5896"/>
+            <w:vAlign w:val="center"/>
+            <w:tcMar>
+              <w:top w:w="75" w:type="dxa"/>
+              <w:start w:w="80" w:type="dxa"/>
+              <w:bottom w:w="75" w:type="dxa"/>
+              <w:end w:w="80" w:type="dxa"/>
+            </w:tcMar>
+            <w:tcBorders>
+              <w:bottom w:val="single" w:sz="3" w:color="D7D7D7"/>
+            </w:tcBorders>
+          </w:tcPr>
+          <w:p>
+            <w:pPr>
+              <w:pStyle w:val="TableText"/>
+            </w:pPr>
+            <w:r>
+              <w:rPr>
+                <w:rFonts w:ascii="Consolas" w:hAnsi="Consolas"/>
+                <w:sz w:val="18"/>
+              </w:rPr>
+              <w:t>app/statistics.py</w:t>
+            </w:r>
+            <w:r>
+              <w:t>保留原文、数字明细与平均值，</w:t>
+            </w:r>
+            <w:r>
+              <w:rPr>
+                <w:rFonts w:ascii="Consolas" w:hAnsi="Consolas"/>
+                <w:sz w:val="18"/>
+              </w:rPr>
+              <w:t>app/surveys.py</w:t>
+            </w:r>
+            <w:r>
+              <w:t>提供整卷和单题页；</w:t>
+            </w:r>
+            <w:r>
+              <w:rPr>
+                <w:rFonts w:ascii="Consolas" w:hAnsi="Consolas"/>
+                <w:sz w:val="18"/>
+              </w:rPr>
+              <w:t>tests/test_statistics.py</w:t>
+            </w:r>
+            <w:r>
+              <w:t>验证。数学题默认以答案分布为主，平均值仍保留。</w:t>
+            </w:r>
+          </w:p>
+        </w:tc>
+      </w:tr>
+      <w:tr>
+        <w:tc>
+          <w:tcPr>
+            <w:tcW w:type="dxa" w:w="2891"/>
+            <w:vAlign w:val="center"/>
+            <w:tcMar>
+              <w:top w:w="75" w:type="dxa"/>
+              <w:start w:w="80" w:type="dxa"/>
+              <w:bottom w:w="75" w:type="dxa"/>
+              <w:end w:w="80" w:type="dxa"/>
+            </w:tcMar>
+            <w:tcBorders>
+              <w:bottom w:val="single" w:sz="3" w:color="D7D7D7"/>
+            </w:tcBorders>
+          </w:tcPr>
+          <w:p>
+            <w:pPr>
+              <w:pStyle w:val="TableText"/>
+            </w:pPr>
+            <w:r>
+              <w:t>AI日志须真实写明工具、提示词、所得代码、是否修改、修改内容；报告须分清AI与自己的工作</w:t>
+            </w:r>
+          </w:p>
+        </w:tc>
+        <w:tc>
+          <w:tcPr>
+            <w:tcW w:type="dxa" w:w="5896"/>
+            <w:vAlign w:val="center"/>
+            <w:tcMar>
+              <w:top w:w="75" w:type="dxa"/>
+              <w:start w:w="80" w:type="dxa"/>
+              <w:bottom w:w="75" w:type="dxa"/>
+              <w:end w:w="80" w:type="dxa"/>
+            </w:tcMar>
+            <w:tcBorders>
+              <w:bottom w:val="single" w:sz="3" w:color="D7D7D7"/>
+            </w:tcBorders>
+          </w:tcPr>
+          <w:p>
+            <w:pPr>
+              <w:pStyle w:val="TableText"/>
+            </w:pPr>
+            <w:r>
+              <w:t>本报告“AI使用过程”保留36项需求与纠错链条，并将可核对的原话单列；整理后的内容明确标注非逐字提示词，不能冒充原始聊天记录。</w:t>
+            </w:r>
+          </w:p>
+        </w:tc>
+      </w:tr>
+      <w:tr>
+        <w:tc>
+          <w:tcPr>
+            <w:tcW w:type="dxa" w:w="2891"/>
+            <w:vAlign w:val="center"/>
+            <w:tcMar>
+              <w:top w:w="75" w:type="dxa"/>
+              <w:start w:w="80" w:type="dxa"/>
+              <w:bottom w:w="75" w:type="dxa"/>
+              <w:end w:w="80" w:type="dxa"/>
+            </w:tcMar>
+            <w:tcBorders>
+              <w:bottom w:val="single" w:sz="3" w:color="D7D7D7"/>
+            </w:tcBorders>
+          </w:tcPr>
+          <w:p>
+            <w:pPr>
+              <w:pStyle w:val="TableText"/>
+            </w:pPr>
+            <w:r>
+              <w:t>测试至少覆盖创建、加题、跳转、校验、提交、统计，并写明步骤</w:t>
+            </w:r>
+          </w:p>
+        </w:tc>
+        <w:tc>
+          <w:tcPr>
+            <w:tcW w:type="dxa" w:w="5896"/>
+            <w:vAlign w:val="center"/>
+            <w:tcMar>
+              <w:top w:w="75" w:type="dxa"/>
+              <w:start w:w="80" w:type="dxa"/>
+              <w:bottom w:w="75" w:type="dxa"/>
+              <w:end w:w="80" w:type="dxa"/>
+            </w:tcMar>
+            <w:tcBorders>
+              <w:bottom w:val="single" w:sz="3" w:color="D7D7D7"/>
+            </w:tcBorders>
+          </w:tcPr>
+          <w:p>
+            <w:pPr>
+              <w:pStyle w:val="TableText"/>
+            </w:pPr>
+            <w:r>
+              <w:rPr>
+                <w:rFonts w:ascii="Consolas" w:hAnsi="Consolas"/>
+                <w:sz w:val="18"/>
+              </w:rPr>
+              <w:t>docs/测试用例与结果.md</w:t>
+            </w:r>
+            <w:r>
+              <w:t>列步骤、输入、预期/实际输出和结果；</w:t>
+            </w:r>
+            <w:r>
+              <w:rPr>
+                <w:rFonts w:ascii="Consolas" w:hAnsi="Consolas"/>
+                <w:sz w:val="18"/>
+              </w:rPr>
+              <w:t>tests/</w:t>
+            </w:r>
+            <w:r>
+              <w:t>、运行日志和页面截图提供不同层面的证据。</w:t>
+            </w:r>
+          </w:p>
+        </w:tc>
+      </w:tr>
+      <w:tr>
+        <w:tc>
+          <w:tcPr>
+            <w:tcW w:type="dxa" w:w="2891"/>
+            <w:vAlign w:val="center"/>
+            <w:tcMar>
+              <w:top w:w="75" w:type="dxa"/>
+              <w:start w:w="80" w:type="dxa"/>
+              <w:bottom w:w="75" w:type="dxa"/>
+              <w:end w:w="80" w:type="dxa"/>
+            </w:tcMar>
+            <w:tcBorders>
+              <w:bottom w:val="single" w:sz="3" w:color="D7D7D7"/>
+            </w:tcBorders>
+          </w:tcPr>
+          <w:p>
+            <w:pPr>
+              <w:pStyle w:val="TableText"/>
+            </w:pPr>
+            <w:r>
+              <w:t>提交可运行代码、MongoDB schema、配置说明、系统/数据库/API/逻辑文档、测试与报告</w:t>
+            </w:r>
+          </w:p>
+        </w:tc>
+        <w:tc>
+          <w:tcPr>
+            <w:tcW w:type="dxa" w:w="5896"/>
+            <w:vAlign w:val="center"/>
+            <w:tcMar>
+              <w:top w:w="75" w:type="dxa"/>
+              <w:start w:w="80" w:type="dxa"/>
+              <w:bottom w:w="75" w:type="dxa"/>
+              <w:end w:w="80" w:type="dxa"/>
+            </w:tcMar>
+            <w:tcBorders>
+              <w:bottom w:val="single" w:sz="3" w:color="D7D7D7"/>
+            </w:tcBorders>
+          </w:tcPr>
+          <w:p>
+            <w:pPr>
+              <w:pStyle w:val="TableText"/>
+            </w:pPr>
+            <w:r>
+              <w:rPr>
+                <w:rFonts w:ascii="Consolas" w:hAnsi="Consolas"/>
+                <w:sz w:val="18"/>
+              </w:rPr>
+              <w:t>README.md</w:t>
+            </w:r>
+            <w:r>
+              <w:t>、</w:t>
+            </w:r>
+            <w:r>
+              <w:rPr>
+                <w:rFonts w:ascii="Consolas" w:hAnsi="Consolas"/>
+                <w:sz w:val="18"/>
+              </w:rPr>
+              <w:t>.env.example</w:t>
+            </w:r>
+            <w:r>
+              <w:t>、</w:t>
+            </w:r>
+            <w:r>
+              <w:rPr>
+                <w:rFonts w:ascii="Consolas" w:hAnsi="Consolas"/>
+                <w:sz w:val="18"/>
+              </w:rPr>
+              <w:t>docs/MongoDB-schema.md</w:t>
+            </w:r>
+            <w:r>
+              <w:t>、</w:t>
+            </w:r>
+            <w:r>
+              <w:rPr>
+                <w:rFonts w:ascii="Consolas" w:hAnsi="Consolas"/>
+                <w:sz w:val="18"/>
+              </w:rPr>
+              <w:t>docs/系统与数据库设计.md</w:t>
+            </w:r>
+            <w:r>
+              <w:t>、</w:t>
+            </w:r>
+            <w:r>
+              <w:rPr>
+                <w:rFonts w:ascii="Consolas" w:hAnsi="Consolas"/>
+                <w:sz w:val="18"/>
+              </w:rPr>
+              <w:t>API.md</w:t>
+            </w:r>
+            <w:r>
+              <w:t>、</w:t>
+            </w:r>
+            <w:r>
+              <w:rPr>
+                <w:rFonts w:ascii="Consolas" w:hAnsi="Consolas"/>
+                <w:sz w:val="18"/>
+              </w:rPr>
+              <w:t>docs/测试用例与结果.md</w:t>
+            </w:r>
+            <w:r>
+              <w:t>与本报告对应。</w:t>
+            </w:r>
+          </w:p>
+        </w:tc>
+      </w:tr>
+    </w:tbl>
+    <w:p>
+      <w:pPr>
+        <w:pStyle w:val="AfterTable"/>
+      </w:pPr>
+    </w:p>
+    <w:p>
+      <w:pPr>
+        <w:ind w:firstLine="420"/>
+      </w:pPr>
+      <w:r>
+        <w:t>原文件评分表分别给MongoDB设计35分、后端逻辑25分、测试10分、文档15分、AI使用说明15分；两阶段总成绩按第一阶段30%、第二阶段70%计算。因此上述核对不能仅以页面截图或“能打开网站”代替。公网入口可访问与公网完整流程验收是两回事，证据范围在测试结果中分别说明。</w:t>
       </w:r>
     </w:p>
     <w:p>
@@ -1145,50 +2698,70 @@
         <w:t>OK</w:t>
       </w:r>
       <w:r>
-        <w:t>，退出码为0。公网首页和API入口返回HTTP 200。各项测试的步骤、输入、输出和结果见</w:t>
-      </w:r>
-      <w:r>
-        <w:rPr>
-          <w:u w:val="single"/>
-        </w:rPr>
-        <w:t>测试用例与结果</w:t>
-      </w:r>
-      <w:r>
-        <w:t>。33张流程截图的对应关系见</w:t>
-      </w:r>
-      <w:r>
-        <w:rPr>
-          <w:u w:val="single"/>
-        </w:rPr>
-        <w:t>测试截图证据索引</w:t>
-      </w:r>
-      <w:r>
-        <w:t>，原始输出见</w:t>
-      </w:r>
-      <w:r>
-        <w:rPr>
-          <w:u w:val="single"/>
-        </w:rPr>
-        <w:t>测试运行记录</w:t>
-      </w:r>
-      <w:r>
-        <w:t>。截图保存在</w:t>
+        <w:t>，退出码为0；2026年10月22日再次运行，结果为</w:t>
       </w:r>
       <w:r>
         <w:rPr>
           <w:rFonts w:ascii="Consolas" w:hAnsi="Consolas"/>
           <w:sz w:val="18"/>
         </w:rPr>
-        <w:t>output/第一阶段_实际运行流程/</w:t>
-      </w:r>
-      <w:r>
-        <w:t>，题目较多时的页面检查保存在</w:t>
+        <w:t>Ran 41 tests in 111.070s</w:t>
+      </w:r>
+      <w:r>
+        <w:t>、</w:t>
       </w:r>
       <w:r>
         <w:rPr>
           <w:rFonts w:ascii="Consolas" w:hAnsi="Consolas"/>
           <w:sz w:val="18"/>
         </w:rPr>
+        <w:t>OK</w:t>
+      </w:r>
+      <w:r>
+        <w:t>，退出码仍为0。公网首页和API入口此前返回HTTP 200。各项测试的步骤、输入、输出和结果见</w:t>
+      </w:r>
+      <w:r>
+        <w:rPr>
+          <w:u w:val="single"/>
+        </w:rPr>
+        <w:t>测试用例与结果</w:t>
+      </w:r>
+      <w:r>
+        <w:t>。33张流程截图的对应关系见</w:t>
+      </w:r>
+      <w:r>
+        <w:rPr>
+          <w:u w:val="single"/>
+        </w:rPr>
+        <w:t>测试截图证据索引</w:t>
+      </w:r>
+      <w:r>
+        <w:t>，原始输出见</w:t>
+      </w:r>
+      <w:r>
+        <w:rPr>
+          <w:u w:val="single"/>
+        </w:rPr>
+        <w:t>测试运行记录</w:t>
+      </w:r>
+      <w:r>
+        <w:t>。截图保存在</w:t>
+      </w:r>
+      <w:r>
+        <w:rPr>
+          <w:rFonts w:ascii="Consolas" w:hAnsi="Consolas"/>
+          <w:sz w:val="18"/>
+        </w:rPr>
+        <w:t>output/第一阶段_实际运行流程/</w:t>
+      </w:r>
+      <w:r>
+        <w:t>，题目较多时的页面检查保存在</w:t>
+      </w:r>
+      <w:r>
+        <w:rPr>
+          <w:rFonts w:ascii="Consolas" w:hAnsi="Consolas"/>
+          <w:sz w:val="18"/>
+        </w:rPr>
         <w:t>output/大题量体验检查/</w:t>
       </w:r>
       <w:r>
@@ -1562,7 +3135,7 @@
         <w:ind w:firstLine="420"/>
       </w:pPr>
       <w:r>
-        <w:t>作业文件要求写明使用的工具、提示词、AI生成的代码、是否修改以及修改内容。下文按开发顺序整理36项任务。第01项记录我最初提出的系统方案，后续条目记录功能细化、页面检查、统计、部署和文档整理。每项列出具体要求、AI的初步实现、我发现的问题及对应修改。同一项任务中的多轮指令合并呈现，因此表格不等于逐字的聊天记录。表格后列出部分实际代码，并说明哪些结果需要我继续检查和纠正。</w:t>
+        <w:t>作业文件第5.1节要求真实写明工具、提示词、得到的代码、是否修改和修改内容。本节先列现有对话中可核对的原话，再按开发过程整理36项任务，逐项注明AI生成的代码与后续修改。36项任务把同一问题的多轮指令合并，属于需求记录，不是逐字聊天记录；不能把它们当成当时一次性发出的原始Prompt。无法从现有记录确认的最初措辞，不以引号伪称原话。代码节选和最终文件可据此核对AI的产出，页面截图与测试说明则用于核对修改效果。</w:t>
       </w:r>
     </w:p>
     <w:p>
@@ -1578,11 +3151,43 @@
         <w:pStyle w:val="Heading2"/>
       </w:pPr>
       <w:r>
-        <w:t>一、基础功能与技术方案</w:t>
+        <w:t>可核对的原始提示词</w:t>
       </w:r>
     </w:p>
     <w:p>
       <w:pPr>
+        <w:ind w:firstLine="420"/>
+      </w:pPr>
+      <w:r>
+        <w:t>以下均为开发对话中完整的一条消息原文，没有把后来要求倒填进初次设计。每条消息只代表当时提出的事项，其对应代码与修改见后面的任务记录。其余多轮修改在后文按内容整理，并明确标注非逐字。</w:t>
+      </w:r>
+    </w:p>
+    <w:p>
+      <w:pPr>
+        <w:ind w:firstLine="420"/>
+      </w:pPr>
+      <w:r>
+        <w:t>1. Prompt：「是必答题不要标出来，是不是必须答的在最上面加个括号（选答），大部分题目正常不就应该必答吗！然后答题的时候你现在这样很不方便，必须一题一题翻，我希望是加个可以总览看那些题答了哪些题没答的，然后提交的时候如果有非选做题未答会提示并且答完了才能提交。这样不是会方便很多吗」2. Prompt：「还有应该是可以选择用1234还是ABCD的题目序号」AI误解为题号，后续明确纠正为选择题的选项编号，题号始终用数字，见第12项。3. Prompt：「提交的时候还要让确认一下呀」4. Prompt：「不只是显示的问题，创建和发布不是一个时间，你现在显示的是真正的发布时间吗」5. Prompt：「不能是同网络才行」6. Prompt：「首先，如果不是同一wifi呢，有没有别的方法，考虑全面了，其次，有没有办法弄完整json api，要求包括api测试」7. Prompt：「还有查看答卷，连完整题目都看不到吗」8. Prompt：「为什么所有地方都要给题目都列出来，如果是几百题且每道题都很长怎么办，根本没必要」9. Prompt：「不只是这小部分，是整个系统各部分都要考虑到」10. Prompt：「同时对于每一题也可以方便地看各个选项那些人选或者哪种答案那些人写，反正就是要尽可能统计丰富、方便创建问卷者看」11. Prompt：「现在全部再查一遍指出所有存在的问题、用户还可能不舒服、体验不好、操作比较麻烦、视觉效果不好等的地方」12. Prompt：「你是要保证在各浏览器都能有显示的功能，最好不要是汉字的显示」13. Prompt：「那你继续验证，去掉现在的问卷，改成问卷一个是简单数学题，一个是关于对足球的了解，题目不能瞎出」14. Prompt：「数学都是答案唯一的题目，足球可以包括主观的，比如你对足球的兴趣，由此展开分支，也可以问你最喜欢的球员」15. Prompt：「不是按照喜欢的球员，就是按照对足球的了解程度分支，了解的问的深一点，」第14条提出的分支方向在此处修正，最终以这条为准。16. Prompt：「然后你每个账号都回答一下来统计」17. Prompt：「不是这类，你要考虑的是全部的，不要这个改掉了下次别的问卷又出一样的问题」18. Prompt：「测试用例要求很多，这是你后台就能完成还是需要我自己做去截图」19. Prompt：「那也不能一张截图都没有吧」20. Prompt：「要传到git仓库」</w:t>
+      </w:r>
+    </w:p>
+    <w:p>
+      <w:pPr>
+        <w:ind w:firstLine="420"/>
+      </w:pPr>
+      <w:r>
+        <w:t>上面的第2条是AI误读的例子，第14—15条记录了用户对分支依据的进一步明确。原话列表不能代替完整的代码与修改记录；后面的36项按“Prompt（整理）—Result—是否修改—修改”展开。</w:t>
+      </w:r>
+    </w:p>
+    <w:p>
+      <w:pPr>
+        <w:pStyle w:val="Heading2"/>
+      </w:pPr>
+      <w:r>
+        <w:t>一、基础功能与技术方案</w:t>
+      </w:r>
+    </w:p>
+    <w:p>
+      <w:pPr>
         <w:pStyle w:val="LogHeading"/>
         <w:keepNext/>
       </w:pPr>
@@ -1601,7 +3206,7 @@
         <w:rPr>
           <w:b/>
         </w:rPr>
-        <w:t>我的提示词：</w:t>
+        <w:t>Prompt（多轮指令整理，非逐字原话）：</w:t>
       </w:r>
       <w:r>
         <w:t>请建立一个可以实际使用的在线问卷系统。用户注册、登录后，可以创建和管理自己的问卷，不能修改别人的问卷。新问卷先保存为草稿，创建者填写标题和说明，设置是否允许匿名、每个账号可以填写几次以及截止时间，再按顺序添加题目。题目包括单选、多选、文本填空和数字填空，选项和作答限制应由创建者设置，不能只用程序里写死的示例题。创建者还要能根据不同答案自行设置条件跳转，不能把演示问卷的跳法写死在程序中。检查无误后发布问卷，填写者通过分享链接进入，系统按答案显示后续题目。提交时只检查实际需要回答的题目，保存这次答卷。提交成功后，填写者可以回看自己的答卷，创建者可以查看答卷以及整份问卷、每道题的统计结果。账号、问卷、题目设置、跳转规则和答卷都要保存在MongoDB中，让创建、填写、提交和查看使用同一份数据，真正连通。</w:t>
@@ -1615,7 +3220,7 @@
         <w:rPr>
           <w:b/>
         </w:rPr>
-        <w:t>AI生成的代码和初步结果：</w:t>
+        <w:t>Result（AI生成的代码和初步结果）：</w:t>
       </w:r>
       <w:r>
         <w:rPr>
@@ -1690,7 +3295,7 @@
         <w:rPr>
           <w:b/>
         </w:rPr>
-        <w:t>检查与修改：</w:t>
+        <w:t>修改：</w:t>
       </w:r>
       <w:r>
         <w:t>后来我要求完整验证实际流程。AI增加</w:t>
@@ -1726,7 +3331,7 @@
         <w:rPr>
           <w:b/>
         </w:rPr>
-        <w:t>我的提示词：</w:t>
+        <w:t>Prompt（多轮指令整理，非逐字原话）：</w:t>
       </w:r>
       <w:r>
         <w:t>先完成账号注册、登录和退出。登录后进入个人页面，每个人只能管理自己的问卷。账号信息要存入MongoDB，问卷管理操作要对应当前登录账号。</w:t>
@@ -1740,7 +3345,7 @@
         <w:rPr>
           <w:b/>
         </w:rPr>
-        <w:t>AI生成的代码和初步结果：</w:t>
+        <w:t>Result（AI生成的代码和初步结果）：</w:t>
       </w:r>
       <w:r>
         <w:rPr>
@@ -1805,7 +3410,7 @@
         <w:rPr>
           <w:b/>
         </w:rPr>
-        <w:t>检查与修改：</w:t>
+        <w:t>修改：</w:t>
       </w:r>
       <w:r>
         <w:t>初版登录页的入口不够清楚。我后来要求调整按钮和内容的排列，并把重复的密码显示控件改成一个眼睛图标按钮，见</w:t>
@@ -1851,7 +3456,7 @@
         <w:rPr>
           <w:b/>
         </w:rPr>
-        <w:t>我的提示词：</w:t>
+        <w:t>Prompt（多轮指令整理，非逐字原话）：</w:t>
       </w:r>
       <w:r>
         <w:t>创建者需要创建、查看、编辑、发布、关闭和删除自己的问卷。问卷要有标题、说明、是否允许匿名、每个账号的填写次数与截止时间，发布后形成可分享的填写链接。</w:t>
@@ -1865,7 +3470,7 @@
         <w:rPr>
           <w:b/>
         </w:rPr>
-        <w:t>AI生成的代码和初步结果：</w:t>
+        <w:t>Result（AI生成的代码和初步结果）：</w:t>
       </w:r>
       <w:r>
         <w:rPr>
@@ -1950,7 +3555,7 @@
         <w:rPr>
           <w:b/>
         </w:rPr>
-        <w:t>检查与修改：</w:t>
+        <w:t>修改：</w:t>
       </w:r>
       <w:r>
         <w:t>实际检查编辑页后，我指出信息混在一起、日期输入不直观，AI才调整表单分组和日期快捷选择，创建时间与发布时间的区别在第26项纠正。</w:t>
@@ -1976,7 +3581,7 @@
         <w:rPr>
           <w:b/>
         </w:rPr>
-        <w:t>我的提示词：</w:t>
+        <w:t>Prompt（多轮指令整理，非逐字原话）：</w:t>
       </w:r>
       <w:r>
         <w:t>问卷应能添加单选、多选、文本填空和数字填空题。创建者能设定选项、多选数量、文本字数、数字范围及整数要求，填写者提交的答案必须符合每道题的设置。</w:t>
@@ -1990,7 +3595,7 @@
         <w:rPr>
           <w:b/>
         </w:rPr>
-        <w:t>AI生成的代码和初步结果：</w:t>
+        <w:t>Result（AI生成的代码和初步结果）：</w:t>
       </w:r>
       <w:r>
         <w:rPr>
@@ -2055,7 +3660,7 @@
         <w:rPr>
           <w:b/>
         </w:rPr>
-        <w:t>检查与修改：</w:t>
+        <w:t>修改：</w:t>
       </w:r>
       <w:r>
         <w:t>实际使用题目编辑器后，我指出“恰好选择”“必须选择数”等文案不自然，并要求选项移动、删除和预览，AI后续修改编辑控件和提示，见</w:t>
@@ -2091,7 +3696,7 @@
         <w:rPr>
           <w:b/>
         </w:rPr>
-        <w:t>我的提示词：</w:t>
+        <w:t>Prompt（多轮指令整理，非逐字原话）：</w:t>
       </w:r>
       <w:r>
         <w:t>创建者要能自己配置单选、多选和数字题的条件跳转，不能把示例问卷的分支直接写死在代码中。不同答案可以进入不同的后续题目，跳转目标必须位于当前题目之后。</w:t>
@@ -2105,7 +3710,7 @@
         <w:rPr>
           <w:b/>
         </w:rPr>
-        <w:t>AI生成的代码和初步结果：</w:t>
+        <w:t>Result（AI生成的代码和初步结果）：</w:t>
       </w:r>
       <w:r>
         <w:rPr>
@@ -2180,7 +3785,7 @@
         <w:rPr>
           <w:b/>
         </w:rPr>
-        <w:t>检查与修改：</w:t>
+        <w:t>修改：</w:t>
       </w:r>
       <w:r>
         <w:t>初版操作入口不够清楚，我后来要求目标更容易找、可返回前页，并检查规则顺序、重叠和失效问题，见</w:t>
@@ -2236,7 +3841,7 @@
         <w:rPr>
           <w:b/>
         </w:rPr>
-        <w:t>我的提示词：</w:t>
+        <w:t>Prompt（多轮指令整理，非逐字原话）：</w:t>
       </w:r>
       <w:r>
         <w:t>填写时根据当前答案决定实际题目路径，跳过的题目不应显示为漏答，也不能要求填写。服务端必须重新计算路径和校验答案，不能只相信浏览器，成功提交时保存这次真正经过的题目及其答案。</w:t>
@@ -2250,7 +3855,7 @@
         <w:rPr>
           <w:b/>
         </w:rPr>
-        <w:t>AI生成的代码和初步结果：</w:t>
+        <w:t>Result（AI生成的代码和初步结果）：</w:t>
       </w:r>
       <w:r>
         <w:rPr>
@@ -2315,7 +3920,7 @@
         <w:rPr>
           <w:b/>
         </w:rPr>
-        <w:t>检查与修改：</w:t>
+        <w:t>修改：</w:t>
       </w:r>
       <w:r>
         <w:t>我要求跳过的题不算漏答，服务端不能信任前端结果。</w:t>
@@ -2361,7 +3966,7 @@
         <w:rPr>
           <w:b/>
         </w:rPr>
-        <w:t>我的提示词：</w:t>
+        <w:t>Prompt（多轮指令整理，非逐字原话）：</w:t>
       </w:r>
       <w:r>
         <w:t>创建者应能查看整份问卷和每道题的统计。单选按选项人数、多选按选项被选次数、文本按实际回答、数字按适合题意的结果展示，统计必须从已提交答卷计算，不能用静态示例结果。</w:t>
@@ -2375,7 +3980,7 @@
         <w:rPr>
           <w:b/>
         </w:rPr>
-        <w:t>AI生成的代码和初步结果：</w:t>
+        <w:t>Result（AI生成的代码和初步结果）：</w:t>
       </w:r>
       <w:r>
         <w:rPr>
@@ -2440,7 +4045,7 @@
         <w:rPr>
           <w:b/>
         </w:rPr>
-        <w:t>检查与修改：</w:t>
+        <w:t>修改：</w:t>
       </w:r>
       <w:r>
         <w:t>我后来指出原设计的统计信息选择不合理，要求适配题型和题量，修改过程见下文21—27。</w:t>
@@ -2466,7 +4071,7 @@
         <w:rPr>
           <w:b/>
         </w:rPr>
-        <w:t>我的提示词：</w:t>
+        <w:t>Prompt（多轮指令整理，非逐字原话）：</w:t>
       </w:r>
       <w:r>
         <w:t>提供完整的JSON API，并写清请求、响应、状态码和使用方法。API要覆盖账号、问卷、题目、发布、填写和统计，使用与网页一致的权限及校验，请通过真实HTTP请求走通注册、创建、发布、提交和读取结果。</w:t>
@@ -2480,7 +4085,7 @@
         <w:rPr>
           <w:b/>
         </w:rPr>
-        <w:t>AI生成的代码和初步结果：</w:t>
+        <w:t>Result（AI生成的代码和初步结果）：</w:t>
       </w:r>
       <w:r>
         <w:rPr>
@@ -2535,7 +4140,7 @@
         <w:rPr>
           <w:b/>
         </w:rPr>
-        <w:t>检查与修改：</w:t>
+        <w:t>修改：</w:t>
       </w:r>
       <w:r>
         <w:t>我要求真正测试而非口头说能测。</w:t>
@@ -2579,7 +4184,7 @@
         <w:rPr>
           <w:b/>
         </w:rPr>
-        <w:t>我的提示词：</w:t>
+        <w:t>Prompt（多轮指令整理，非逐字原话）：</w:t>
       </w:r>
       <w:r>
         <w:t>请检查第一阶段整个系统的使用体验，不要只改某个页面。首页、问卷列表、题目编辑、填写、答卷查看和统计都要检查。排版、颜色、文字、按钮、长页面操作和返回入口应清楚、美观、方便，不能只求功能可以运行。</w:t>
@@ -2593,7 +4198,7 @@
         <w:rPr>
           <w:b/>
         </w:rPr>
-        <w:t>AI生成的代码和初步结果：</w:t>
+        <w:t>Result（AI生成的代码和初步结果）：</w:t>
       </w:r>
       <w:r>
         <w:t>最终文件：</w:t>
@@ -2651,7 +4256,7 @@
         <w:rPr>
           <w:b/>
         </w:rPr>
-        <w:t>检查与修改：</w:t>
+        <w:t>修改：</w:t>
       </w:r>
       <w:r>
         <w:t>AI修改了样式文件和公共页面</w:t>
@@ -2687,7 +4292,7 @@
         <w:rPr>
           <w:b/>
         </w:rPr>
-        <w:t>我的提示词：</w:t>
+        <w:t>Prompt（多轮指令整理，非逐字原话）：</w:t>
       </w:r>
       <w:r>
         <w:t>重新设计首页和最近问卷区域。创建问卷等主要操作要醒目，“查看全部”不能只是普通文字链接。页面已有内容时不要留下大片空白。问卷卡片里的题号和题目文字，在手机屏幕上也要排得清楚。</w:t>
@@ -2701,7 +4306,7 @@
         <w:rPr>
           <w:b/>
         </w:rPr>
-        <w:t>AI生成的代码和初步结果：</w:t>
+        <w:t>Result（AI生成的代码和初步结果）：</w:t>
       </w:r>
       <w:r>
         <w:t>最终文件：</w:t>
@@ -2749,7 +4354,7 @@
         <w:rPr>
           <w:b/>
         </w:rPr>
-        <w:t>检查与修改：</w:t>
+        <w:t>修改：</w:t>
       </w:r>
       <w:r>
         <w:t>AI调整了主要操作、最近问卷和答卷入口的布局。页面截图见</w:t>
@@ -2785,7 +4390,7 @@
         <w:rPr>
           <w:b/>
         </w:rPr>
-        <w:t>我的提示词：</w:t>
+        <w:t>Prompt（多轮指令整理，非逐字原话）：</w:t>
       </w:r>
       <w:r>
         <w:t>普通题目默认必答，不要在每道题旁边反复写“必答”。只有可以不回答的题目才标“（选答）”。题目编辑页和填写页都要按这个规则显示，避免同一道题在不同页面说法不一致。</w:t>
@@ -2799,7 +4404,7 @@
         <w:rPr>
           <w:b/>
         </w:rPr>
-        <w:t>AI生成的代码和初步结果：</w:t>
+        <w:t>Result（AI生成的代码和初步结果）：</w:t>
       </w:r>
       <w:r>
         <w:t>最终文件：</w:t>
@@ -2847,7 +4452,7 @@
         <w:rPr>
           <w:b/>
         </w:rPr>
-        <w:t>检查与修改：</w:t>
+        <w:t>修改：</w:t>
       </w:r>
       <w:r>
         <w:t>相关页面默认不显示“必答”，只给选答题加上“（选答）”。服务器仍按题目设置检查必答要求。</w:t>
@@ -2873,7 +4478,7 @@
         <w:rPr>
           <w:b/>
         </w:rPr>
-        <w:t>我的提示词：</w:t>
+        <w:t>Prompt（多轮指令整理，非逐字原话）：</w:t>
       </w:r>
       <w:r>
         <w:t>题目序号固定为数字，选择题的每个选项才可以选择用1、2、3、4或A、B、C、D编号。不要再把A/B/C/D当题号，管理页、预览、正式填写和统计页必须使用一致的题号与选项号规则。</w:t>
@@ -2887,7 +4492,7 @@
         <w:rPr>
           <w:b/>
         </w:rPr>
-        <w:t>AI生成的代码和初步结果：</w:t>
+        <w:t>Result（AI生成的代码和初步结果）：</w:t>
       </w:r>
       <w:r>
         <w:t>最终文件：</w:t>
@@ -2935,7 +4540,7 @@
         <w:rPr>
           <w:b/>
         </w:rPr>
-        <w:t>检查与修改：</w:t>
+        <w:t>修改：</w:t>
       </w:r>
       <w:r>
         <w:rPr>
@@ -2998,7 +4603,7 @@
         <w:rPr>
           <w:b/>
         </w:rPr>
-        <w:t>我的提示词：</w:t>
+        <w:t>Prompt（多轮指令整理，非逐字原话）：</w:t>
       </w:r>
       <w:r>
         <w:t>把题号与题目正文做视觉区分，避免“1.1+1=”看起来像同一串内容。题号使用独立编号块并保持间距，长标题换行时编号不能被挤成上下两个数字。</w:t>
@@ -3012,7 +4617,7 @@
         <w:rPr>
           <w:b/>
         </w:rPr>
-        <w:t>AI生成的代码和初步结果：</w:t>
+        <w:t>Result（AI生成的代码和初步结果）：</w:t>
       </w:r>
       <w:r>
         <w:t>最终文件：</w:t>
@@ -3060,7 +4665,7 @@
         <w:rPr>
           <w:b/>
         </w:rPr>
-        <w:t>检查与修改：</w:t>
+        <w:t>修改：</w:t>
       </w:r>
       <w:r>
         <w:t>管理页和答题页改用独立编号块与间距，</w:t>
@@ -3106,7 +4711,7 @@
         <w:rPr>
           <w:b/>
         </w:rPr>
-        <w:t>我的提示词：</w:t>
+        <w:t>Prompt（多轮指令整理，非逐字原话）：</w:t>
       </w:r>
       <w:r>
         <w:t>题目创建和编辑页的“取消”必须真的能返回，预览页也要有清楚的返回问卷入口。填写过程中应有回到前一步或退出的方式，避免用户依赖浏览器后退，未保存内容离开时给出恰当提醒。</w:t>
@@ -3120,7 +4725,7 @@
         <w:rPr>
           <w:b/>
         </w:rPr>
-        <w:t>AI生成的代码和初步结果：</w:t>
+        <w:t>Result（AI生成的代码和初步结果）：</w:t>
       </w:r>
       <w:r>
         <w:t>最终文件：</w:t>
@@ -3168,7 +4773,7 @@
         <w:rPr>
           <w:b/>
         </w:rPr>
-        <w:t>检查与修改：</w:t>
+        <w:t>修改：</w:t>
       </w:r>
       <w:r>
         <w:t>题目编辑/创建、预览等页面增加明确的返回链接，表单未保存时的离开提醒由</w:t>
@@ -3204,7 +4809,7 @@
         <w:rPr>
           <w:b/>
         </w:rPr>
-        <w:t>我的提示词：</w:t>
+        <w:t>Prompt（多轮指令整理，非逐字原话）：</w:t>
       </w:r>
       <w:r>
         <w:t>填写者不要只能一题一题翻。提供题目总览，让用户随时看到当前路径上哪些题已答、哪些未答、哪些需要修改，并能直接定位到相应题目，条件跳转变化后，总览应同步更新。</w:t>
@@ -3218,7 +4823,7 @@
         <w:rPr>
           <w:b/>
         </w:rPr>
-        <w:t>AI生成的代码和初步结果：</w:t>
+        <w:t>Result（AI生成的代码和初步结果）：</w:t>
       </w:r>
       <w:r>
         <w:t>最终文件：</w:t>
@@ -3266,7 +4871,7 @@
         <w:rPr>
           <w:b/>
         </w:rPr>
-        <w:t>检查与修改：</w:t>
+        <w:t>修改：</w:t>
       </w:r>
       <w:r>
         <w:rPr>
@@ -3319,7 +4924,7 @@
         <w:rPr>
           <w:b/>
         </w:rPr>
-        <w:t>我的提示词：</w:t>
+        <w:t>Prompt（多轮指令整理，非逐字原话）：</w:t>
       </w:r>
       <w:r>
         <w:t>点击提交时检查实际路径上的必答题：未答或不符合限制就提示并阻止提交，用户改正后才能继续。提示尽量简洁，例如“你还未作答本题”，不要再次复制长题目或把已跳过的题列为错误。</w:t>
@@ -3333,7 +4938,7 @@
         <w:rPr>
           <w:b/>
         </w:rPr>
-        <w:t>AI生成的代码和初步结果：</w:t>
+        <w:t>Result（AI生成的代码和初步结果）：</w:t>
       </w:r>
       <w:r>
         <w:t>最终文件：</w:t>
@@ -3391,7 +4996,7 @@
         <w:rPr>
           <w:b/>
         </w:rPr>
-        <w:t>检查与修改：</w:t>
+        <w:t>修改：</w:t>
       </w:r>
       <w:r>
         <w:t>提示缩为“你还未作答本题”，</w:t>
@@ -3447,7 +5052,7 @@
         <w:rPr>
           <w:b/>
         </w:rPr>
-        <w:t>我的提示词：</w:t>
+        <w:t>Prompt（多轮指令整理，非逐字原话）：</w:t>
       </w:r>
       <w:r>
         <w:t>合法答卷提交前再让填写者确认一次，明确说明“提交后这份答卷不可修改”。取消确认不能写入答卷，确认后保存并显示提交成功，已提交的答卷只能查看不能编辑。</w:t>
@@ -3461,7 +5066,7 @@
         <w:rPr>
           <w:b/>
         </w:rPr>
-        <w:t>AI生成的代码和初步结果：</w:t>
+        <w:t>Result（AI生成的代码和初步结果）：</w:t>
       </w:r>
       <w:r>
         <w:t>最终文件：</w:t>
@@ -3509,7 +5114,7 @@
         <w:rPr>
           <w:b/>
         </w:rPr>
-        <w:t>检查与修改：</w:t>
+        <w:t>修改：</w:t>
       </w:r>
       <w:r>
         <w:rPr>
@@ -3542,7 +5147,7 @@
         <w:rPr>
           <w:b/>
         </w:rPr>
-        <w:t>我的提示词：</w:t>
+        <w:t>Prompt（多轮指令整理，非逐字原话）：</w:t>
       </w:r>
       <w:r>
         <w:t>题目很多时，填写者不应一直从页面顶部滚到最下方才能找题或退出。请提供题目总览、分页、回到顶部和退出填写的快捷入口，并检查这些操作在手机屏幕上是否容易找到。</w:t>
@@ -3556,7 +5161,7 @@
         <w:rPr>
           <w:b/>
         </w:rPr>
-        <w:t>AI生成的代码和初步结果：</w:t>
+        <w:t>Result（AI生成的代码和初步结果）：</w:t>
       </w:r>
       <w:r>
         <w:t>最终文件：</w:t>
@@ -3604,7 +5209,7 @@
         <w:rPr>
           <w:b/>
         </w:rPr>
-        <w:t>检查与修改：</w:t>
+        <w:t>修改：</w:t>
       </w:r>
       <w:r>
         <w:t>填写页增加题目分页、总览、回到顶部和退出填写的快捷操作。大量题目的检查截图保存在</w:t>
@@ -3640,7 +5245,7 @@
         <w:rPr>
           <w:b/>
         </w:rPr>
-        <w:t>我的提示词：</w:t>
+        <w:t>Prompt（多轮指令整理，非逐字原话）：</w:t>
       </w:r>
       <w:r>
         <w:t>“我的答卷”和创建者查看的单份答卷，都要显示完整题目和提交时的答案。选择题先清楚显示选中的内容，想看其他选项时也能展开。题目后来被修改，旧答卷仍应显示提交时的题目，不能拿新题目解释旧答案。</w:t>
@@ -3654,7 +5259,7 @@
         <w:rPr>
           <w:b/>
         </w:rPr>
-        <w:t>AI生成的代码和初步结果：</w:t>
+        <w:t>Result（AI生成的代码和初步结果）：</w:t>
       </w:r>
       <w:r>
         <w:t>最终文件：</w:t>
@@ -3692,7 +5297,7 @@
         <w:rPr>
           <w:b/>
         </w:rPr>
-        <w:t>检查与修改：</w:t>
+        <w:t>修改：</w:t>
       </w:r>
       <w:r>
         <w:t>答卷页显示完整题目和已选答案，也能展开全部选项。答卷较长时可以分页。</w:t>
@@ -3728,7 +5333,7 @@
         <w:rPr>
           <w:b/>
         </w:rPr>
-        <w:t>我的提示词：</w:t>
+        <w:t>Prompt（多轮指令整理，非逐字原话）：</w:t>
       </w:r>
       <w:r>
         <w:t>填写规则的提示语要按正常中文使用逗号和句号，避免每个短条件都用句号隔开。按日期查找答卷时提供“今天”快捷选择，并让首次使用者容易理解日期格式，只按名称查找时不要强制限定日期。</w:t>
@@ -3742,7 +5347,7 @@
         <w:rPr>
           <w:b/>
         </w:rPr>
-        <w:t>AI生成的代码和初步结果：</w:t>
+        <w:t>Result（AI生成的代码和初步结果）：</w:t>
       </w:r>
       <w:r>
         <w:t>最终文件：</w:t>
@@ -3790,7 +5395,7 @@
         <w:rPr>
           <w:b/>
         </w:rPr>
-        <w:t>检查与修改：</w:t>
+        <w:t>修改：</w:t>
       </w:r>
       <w:r>
         <w:t>调整</w:t>
@@ -3854,7 +5459,7 @@
         <w:rPr>
           <w:b/>
         </w:rPr>
-        <w:t>我的提示词：</w:t>
+        <w:t>Prompt（多轮指令整理，非逐字原话）：</w:t>
       </w:r>
       <w:r>
         <w:t>重新核对统计术语：普通必答题不能被描述成可以“留空”，也不要用“到达本题”这种难懂说法。请区分有效回答、实际经过却未答的选答题、条件跳过和旧版本不存在的题目。</w:t>
@@ -3868,7 +5473,7 @@
         <w:rPr>
           <w:b/>
         </w:rPr>
-        <w:t>AI生成的代码和初步结果：</w:t>
+        <w:t>Result（AI生成的代码和初步结果）：</w:t>
       </w:r>
       <w:r>
         <w:t>最终文件：</w:t>
@@ -3916,7 +5521,7 @@
         <w:rPr>
           <w:b/>
         </w:rPr>
-        <w:t>检查与修改：</w:t>
+        <w:t>修改：</w:t>
       </w:r>
       <w:r>
         <w:rPr>
@@ -3959,7 +5564,7 @@
         <w:rPr>
           <w:b/>
         </w:rPr>
-        <w:t>我的提示词：</w:t>
+        <w:t>Prompt（多轮指令整理，非逐字原话）：</w:t>
       </w:r>
       <w:r>
         <w:t>统计页只保留有助于理解回答结果的信息。请删除额外加入的“填写路径分布”，不要把答卷经过哪些题当成调查结果。创建者仍可在问卷管理页查看自己设置的跳转规则。</w:t>
@@ -3973,7 +5578,7 @@
         <w:rPr>
           <w:b/>
         </w:rPr>
-        <w:t>AI生成的代码和初步结果：</w:t>
+        <w:t>Result（AI生成的代码和初步结果）：</w:t>
       </w:r>
       <w:r>
         <w:t>最终文件：</w:t>
@@ -4021,7 +5626,7 @@
         <w:rPr>
           <w:b/>
         </w:rPr>
-        <w:t>检查与修改：</w:t>
+        <w:t>修改：</w:t>
       </w:r>
       <w:r>
         <w:t>统计页和JSON统计接口不再返回路径分布，仍保留每题的有效回答人数。跳转规则在问卷管理页查看。</w:t>
@@ -4047,7 +5652,7 @@
         <w:rPr>
           <w:b/>
         </w:rPr>
-        <w:t>我的提示词：</w:t>
+        <w:t>Prompt（多轮指令整理，非逐字原话）：</w:t>
       </w:r>
       <w:r>
         <w:t>如果一份问卷有几百道题，而且题目很长，管理页、填写页、答卷页和统计页就不能反复列出全部题目。请提供按题号或内容查找、简洁的表格、分页和单题详情。需要时仍要能看到完整题目。</w:t>
@@ -4061,7 +5666,7 @@
         <w:rPr>
           <w:b/>
         </w:rPr>
-        <w:t>AI生成的代码和初步结果：</w:t>
+        <w:t>Result（AI生成的代码和初步结果）：</w:t>
       </w:r>
       <w:r>
         <w:t>最终文件：</w:t>
@@ -4119,7 +5724,7 @@
         <w:rPr>
           <w:b/>
         </w:rPr>
-        <w:t>检查与修改：</w:t>
+        <w:t>修改：</w:t>
       </w:r>
       <w:r>
         <w:t>管理页增加题目查找和分页，统计页增加表格、查找、分页和单题详情。</w:t>
@@ -4155,7 +5760,7 @@
         <w:rPr>
           <w:b/>
         </w:rPr>
-        <w:t>我的提示词：</w:t>
+        <w:t>Prompt（多轮指令整理，非逐字原话）：</w:t>
       </w:r>
       <w:r>
         <w:t>非匿名提交应让问卷创建者看到各账号的答题情况。请在统计或问卷管理中提供具名答卷列表，并能进入每个账号的完整答卷，匿名答卷只能计入统计，不显示可识别身份。</w:t>
@@ -4169,7 +5774,7 @@
         <w:rPr>
           <w:b/>
         </w:rPr>
-        <w:t>AI生成的代码和初步结果：</w:t>
+        <w:t>Result（AI生成的代码和初步结果）：</w:t>
       </w:r>
       <w:r>
         <w:t>最终文件：</w:t>
@@ -4217,7 +5822,7 @@
         <w:rPr>
           <w:b/>
         </w:rPr>
-        <w:t>检查与修改：</w:t>
+        <w:t>修改：</w:t>
       </w:r>
       <w:r>
         <w:rPr>
@@ -4290,7 +5895,7 @@
         <w:rPr>
           <w:b/>
         </w:rPr>
-        <w:t>我的提示词：</w:t>
+        <w:t>Prompt（多轮指令整理，非逐字原话）：</w:t>
       </w:r>
       <w:r>
         <w:t>每一道题的统计也应方便创建者追查：点开某个选项、文本答案或数字答案时，能看到哪些具名账号给出该答案，并能进入对应完整答卷。大量回答时需要筛选和分页。</w:t>
@@ -4304,7 +5909,7 @@
         <w:rPr>
           <w:b/>
         </w:rPr>
-        <w:t>AI生成的代码和初步结果：</w:t>
+        <w:t>Result（AI生成的代码和初步结果）：</w:t>
       </w:r>
       <w:r>
         <w:t>最终文件：</w:t>
@@ -4352,7 +5957,7 @@
         <w:rPr>
           <w:b/>
         </w:rPr>
-        <w:t>检查与修改：</w:t>
+        <w:t>修改：</w:t>
       </w:r>
       <w:r>
         <w:rPr>
@@ -4405,7 +6010,7 @@
         <w:rPr>
           <w:b/>
         </w:rPr>
-        <w:t>我的提示词：</w:t>
+        <w:t>Prompt（多轮指令整理，非逐字原话）：</w:t>
       </w:r>
       <w:r>
         <w:t>问卷列表和详情中的时间要按实际用途显示。创建草稿的时间与实际点击“发布”的时间不是一回事，发布时单独记录发布时间，已发布问卷优先显示真正的发布时间。</w:t>
@@ -4419,7 +6024,7 @@
         <w:rPr>
           <w:b/>
         </w:rPr>
-        <w:t>AI生成的代码和初步结果：</w:t>
+        <w:t>Result（AI生成的代码和初步结果）：</w:t>
       </w:r>
       <w:r>
         <w:t>最终文件：</w:t>
@@ -4467,7 +6072,7 @@
         <w:rPr>
           <w:b/>
         </w:rPr>
-        <w:t>检查与修改：</w:t>
+        <w:t>修改：</w:t>
       </w:r>
       <w:r>
         <w:rPr>
@@ -4540,7 +6145,7 @@
         <w:rPr>
           <w:b/>
         </w:rPr>
-        <w:t>我的提示词：</w:t>
+        <w:t>Prompt（多轮指令整理，非逐字原话）：</w:t>
       </w:r>
       <w:r>
         <w:t>数字题的统计重点应根据题目用途来定。数学题有正确答案，先展示每种答案和选择人数，不要把平均值放在最显眼的位置。也要考虑年龄、时长等测量题，不能只修数学题，却让其他问卷出现同样的问题。</w:t>
@@ -4554,7 +6159,7 @@
         <w:rPr>
           <w:b/>
         </w:rPr>
-        <w:t>AI生成的代码和初步结果：</w:t>
+        <w:t>Result（AI生成的代码和初步结果）：</w:t>
       </w:r>
       <w:r>
         <w:t>最终文件：</w:t>
@@ -4612,7 +6217,7 @@
         <w:rPr>
           <w:b/>
         </w:rPr>
-        <w:t>检查与修改：</w:t>
+        <w:t>修改：</w:t>
       </w:r>
       <w:r>
         <w:t>数字题默认展示各答案的人数。创建者将题目设为测量类时，页面可以突出平均值。其他数字题也仍能查看平均值。</w:t>
@@ -4658,7 +6263,7 @@
         <w:rPr>
           <w:b/>
         </w:rPr>
-        <w:t>我的提示词：</w:t>
+        <w:t>Prompt（多轮指令整理，非逐字原话）：</w:t>
       </w:r>
       <w:r>
         <w:t>不要只拿一份答卷展示统计效果。请让多个演示账号分别回答数学和足球问卷，检查选项频次、数字分布、分支结果和逐人查看，明确这些是合成测试答卷，不能当作真实用户调查。</w:t>
@@ -4672,7 +6277,7 @@
         <w:rPr>
           <w:b/>
         </w:rPr>
-        <w:t>AI生成的代码和初步结果：</w:t>
+        <w:t>Result（AI生成的代码和初步结果）：</w:t>
       </w:r>
       <w:r>
         <w:t>开发时使用辅助脚本生成演示答卷和截图；空统计页或一份答卷不能体现频次、分支与逐人查看。辅助脚本不属于交付代码。</w:t>
@@ -4700,7 +6305,7 @@
         <w:rPr>
           <w:b/>
         </w:rPr>
-        <w:t>检查与修改：</w:t>
+        <w:t>修改：</w:t>
       </w:r>
       <w:r>
         <w:t>开发时为现有演示账号分别提交数学和足球</w:t>
@@ -4753,7 +6358,7 @@
         <w:rPr>
           <w:b/>
         </w:rPr>
-        <w:t>我的提示词：</w:t>
+        <w:t>Prompt（多轮指令整理，非逐字原话）：</w:t>
       </w:r>
       <w:r>
         <w:t>问卷链接必须能让不同网络的人访问。</w:t>
@@ -4777,7 +6382,7 @@
         <w:rPr>
           <w:b/>
         </w:rPr>
-        <w:t>AI生成的代码和初步结果：</w:t>
+        <w:t>Result（AI生成的代码和初步结果）：</w:t>
       </w:r>
       <w:r>
         <w:t>最终文件：</w:t>
@@ -4815,7 +6420,7 @@
         <w:rPr>
           <w:b/>
         </w:rPr>
-        <w:t>检查与修改：</w:t>
+        <w:t>修改：</w:t>
       </w:r>
       <w:r>
         <w:t>系统部署到我提供的腾讯云服务器。</w:t>
@@ -4871,7 +6476,7 @@
         <w:rPr>
           <w:b/>
         </w:rPr>
-        <w:t>我的提示词：</w:t>
+        <w:t>Prompt（多轮指令整理，非逐字原话）：</w:t>
       </w:r>
       <w:r>
         <w:t>请检查公网网站的首页。直接打开网站根地址就应该能进入系统，不能只有在地址后面加上</w:t>
@@ -4895,7 +6500,7 @@
         <w:rPr>
           <w:b/>
         </w:rPr>
-        <w:t>AI生成的代码和初步结果：</w:t>
+        <w:t>Result（AI生成的代码和初步结果）：</w:t>
       </w:r>
       <w:r>
         <w:t>最终文件：</w:t>
@@ -4933,7 +6538,7 @@
         <w:rPr>
           <w:b/>
         </w:rPr>
-        <w:t>检查与修改：</w:t>
+        <w:t>修改：</w:t>
       </w:r>
       <w:r>
         <w:t>检查并修正了首页路由和服务器配置。未登录时打开首页，已登录时进入个人页面。</w:t>
@@ -4969,7 +6574,7 @@
         <w:rPr>
           <w:b/>
         </w:rPr>
-        <w:t>我的提示词：</w:t>
+        <w:t>Prompt（多轮指令整理，非逐字原话）：</w:t>
       </w:r>
       <w:r>
         <w:t>我现在打开问卷列表出现500错误，请先查明为什么打不开并修复，再把相关页面和流程重新检查一遍。不能只凭上一轮“测试通过”的结论回复我，修复后要给出实际可打开的页面。</w:t>
@@ -4983,7 +6588,7 @@
         <w:rPr>
           <w:b/>
         </w:rPr>
-        <w:t>AI生成的代码和初步结果：</w:t>
+        <w:t>Result（AI生成的代码和初步结果）：</w:t>
       </w:r>
       <w:r>
         <w:t>最终文件：</w:t>
@@ -5031,7 +6636,7 @@
         <w:rPr>
           <w:b/>
         </w:rPr>
-        <w:t>检查与修改：</w:t>
+        <w:t>修改：</w:t>
       </w:r>
       <w:r>
         <w:t>随后复查问卷路由与模板并重新运行测试，</w:t>
@@ -5077,7 +6682,7 @@
         <w:rPr>
           <w:b/>
         </w:rPr>
-        <w:t>我的提示词：</w:t>
+        <w:t>Prompt（多轮指令整理，非逐字原话）：</w:t>
       </w:r>
       <w:r>
         <w:t>删除问卷等重要操作不要使用浏览器原生弹窗。改成与系统风格一致的站内确认界面，清楚说明将删除问卷及其答卷，并允许取消，避免误操作。</w:t>
@@ -5091,7 +6696,7 @@
         <w:rPr>
           <w:b/>
         </w:rPr>
-        <w:t>AI生成的代码和初步结果：</w:t>
+        <w:t>Result（AI生成的代码和初步结果）：</w:t>
       </w:r>
       <w:r>
         <w:t>最终文件：</w:t>
@@ -5139,7 +6744,7 @@
         <w:rPr>
           <w:b/>
         </w:rPr>
-        <w:t>检查与修改：</w:t>
+        <w:t>修改：</w:t>
       </w:r>
       <w:r>
         <w:rPr>
@@ -5192,7 +6797,7 @@
         <w:rPr>
           <w:b/>
         </w:rPr>
-        <w:t>我的提示词：</w:t>
+        <w:t>Prompt（多轮指令整理，非逐字原话）：</w:t>
       </w:r>
       <w:r>
         <w:t>把演示数据换成两份有意义的问卷：一份基础数学题，每题有唯一正确答案，一份关于足球的兴趣和规则认知问卷。足球题按填写者对足球的了解程度进入不同深度的分支，不要按最喜欢的球员分支，题目内容要合理。</w:t>
@@ -5206,7 +6811,7 @@
         <w:rPr>
           <w:b/>
         </w:rPr>
-        <w:t>AI生成的代码和初步结果：</w:t>
+        <w:t>Result（AI生成的代码和初步结果）：</w:t>
       </w:r>
       <w:r>
         <w:t>开发时使用辅助脚本更换演示问卷；AI曾误解足球分支依据，早期演示问卷与验收目的不符。辅助脚本不属于交付代码。</w:t>
@@ -5234,7 +6839,7 @@
         <w:rPr>
           <w:b/>
         </w:rPr>
-        <w:t>检查与修改：</w:t>
+        <w:t>修改：</w:t>
       </w:r>
       <w:r>
         <w:t>建立基础数学题和足球兴趣/规则认知两份演示问卷，足球按自评了解程度进入不同深度的题目，并检查统计页、保存图片。</w:t>
@@ -5260,7 +6865,7 @@
         <w:rPr>
           <w:b/>
         </w:rPr>
-        <w:t>我的提示词：</w:t>
+        <w:t>Prompt（多轮指令整理，非逐字原话）：</w:t>
       </w:r>
       <w:r>
         <w:t>测试用例必须列出步骤、输入、实际输出和结果，并用实际运行截图佐证关键操作，不能只写“测试通过”。请在后台完整运行创建、填写、跳转、校验、提交和统计流程，保存原始测试日志与页面截图。</w:t>
@@ -5274,7 +6879,7 @@
         <w:rPr>
           <w:b/>
         </w:rPr>
-        <w:t>AI生成的代码和初步结果：</w:t>
+        <w:t>Result（AI生成的代码和初步结果）：</w:t>
       </w:r>
       <w:r>
         <w:t>最终文件：</w:t>
@@ -5322,7 +6927,7 @@
         <w:rPr>
           <w:b/>
         </w:rPr>
-        <w:t>检查与修改：</w:t>
+        <w:t>修改：</w:t>
       </w:r>
       <w:r>
         <w:rPr>
@@ -5385,7 +6990,7 @@
         <w:rPr>
           <w:b/>
         </w:rPr>
-        <w:t>我的提示词：</w:t>
+        <w:t>Prompt（多轮指令整理，非逐字原话）：</w:t>
       </w:r>
       <w:r>
         <w:t>AI使用记录要按开发过程有条理地写。先写我提出的设计和具体指令，再写AI生成的代码、我发现的问题、对应修改和复测。不能只写几句笼统评价，也不能把后来反复修改的问题说成一开始就设计正确。</w:t>
@@ -5399,7 +7004,7 @@
         <w:rPr>
           <w:b/>
         </w:rPr>
-        <w:t>AI生成的代码和初步结果：</w:t>
+        <w:t>Result（AI生成的代码和初步结果）：</w:t>
       </w:r>
       <w:r>
         <w:t>最终文件：</w:t>
@@ -5437,7 +7042,7 @@
         <w:rPr>
           <w:b/>
         </w:rPr>
-        <w:t>检查与修改：</w:t>
+        <w:t>修改：</w:t>
       </w:r>
       <w:r>
         <w:t>按开发顺序写明最初的设计要求、页面问题、代码修改和复测结果。完成报告也收入这份详细记录，不再用几句摘要代替实际过程。</w:t>
@@ -5463,7 +7068,7 @@
         <w:rPr>
           <w:b/>
         </w:rPr>
-        <w:t>我的提示词：</w:t>
+        <w:t>Prompt（多轮指令整理，非逐字原话）：</w:t>
       </w:r>
       <w:r>
         <w:t>最终报告中的AI使用过程要完整呈现实际需求与修改链条，不能把我给出的指令缩成十项标签，也不能把最终核对原文件写成一开始直接让AI按原文件设计。整理时保留功能结果和纠错先后，去掉不适合正式报告的反问语气，并标清不是逐字聊天记录。</w:t>
@@ -5477,7 +7082,7 @@
         <w:rPr>
           <w:b/>
         </w:rPr>
-        <w:t>AI生成的代码和初步结果：</w:t>
+        <w:t>Result（AI生成的代码和初步结果）：</w:t>
       </w:r>
       <w:r>
         <w:t>最终文件：</w:t>
@@ -5515,7 +7120,7 @@
         <w:rPr>
           <w:b/>
         </w:rPr>
-        <w:t>检查与修改：</w:t>
+        <w:t>修改：</w:t>
       </w:r>
       <w:r>
         <w:rPr>
@@ -6146,7 +7751,7 @@
         <w:pStyle w:val="Heading2"/>
       </w:pPr>
       <w:r>
-        <w:t>AI能做什么、没做好什么，我做了什么</w:t>
+        <w:t>AI使用说明：AI帮了什么、做错了什么、我修改和设计了什么</w:t>
       </w:r>
     </w:p>
     <w:p>
@@ -6154,7 +7759,7 @@
         <w:ind w:firstLine="420"/>
       </w:pPr>
       <w:r>
-        <w:t>AI编写了应用代码、数据库索引、页面、接口、测试脚本和文档，帮助我较快搭起可以运行的系统。但AI起初混淆了题号和选项编号，也没有处理好必答与选答、数学题的统计重点、长问卷查找题目以及具名答卷查看。自动测试通过后，我仍在实际页面上发现问题。因此，AI写出的代码需要按作业要求检查，也需要亲自操作页面验证。</w:t>
+        <w:t>AI帮了什么：Codex编写了应用代码、数据库索引、页面、JSON接口、测试脚本和文档，形成可运行的初版，并根据我提出的问题修改实现。具体产出及保留的源文件见前面的36项记录。</w:t>
       </w:r>
     </w:p>
     <w:p>
@@ -6162,7 +7767,15 @@
         <w:ind w:firstLine="420"/>
       </w:pPr>
       <w:r>
-        <w:t>我提出系统目标和使用要求，检查页面并提供截图，指出不方便或不符合要求的地方，再要求AI修改和重新测试。其中，足球问卷应按了解程度分支，数学题应突出答案分布，匿名和具名答卷的查看范围要分清，分享链接要能跨网络打开。这些都是我在实际检查后明确要求修改的。测试步骤与结果见</w:t>
+        <w:t>AI做错了什么：初版曾混淆题号和选项编号，没有处理好必答与选答、数学题的统计重点、长问卷定位及具名答卷查看。自动测试通过后，实际页面仍暴露出操作和排版问题。报告与AI记录也曾错误压缩多轮指令，把整理稿写得像原始提示词。</w:t>
+      </w:r>
+    </w:p>
+    <w:p>
+      <w:pPr>
+        <w:ind w:firstLine="420"/>
+      </w:pPr>
+      <w:r>
+        <w:t>自己改了什么：我逐页检查实际操作，提供截图并指出问题，明确需要达到的行为，然后要求AI改动、复测并再次检查结果。例如，足球问卷改为按了解程度分支，数字题按题意安排统计重点，匿名与具名答卷分清查看范围，分享链接改为可跨网络访问。测试步骤与结果见</w:t>
       </w:r>
       <w:r>
         <w:rPr>
@@ -6180,7 +7793,15 @@
         <w:t>API说明</w:t>
       </w:r>
       <w:r>
-        <w:t>。</w:t>
+        <w:t>。这些代码修改由AI在我的指令下完成，不应写成我手工编写。</w:t>
+      </w:r>
+    </w:p>
+    <w:p>
+      <w:pPr>
+        <w:ind w:firstLine="420"/>
+      </w:pPr>
+      <w:r>
+        <w:t>自己设计了什么：我以创建、填写、提交、回看和统计的完整使用路径作为验收标准，并明确题号与选项号分工、默认必答而只标选答、按了解程度设置分支、按题意选择统计重点，以及跨网络分享的目标。原作业要求的MongoDB、题型和跳转等最低功能是课程要求，不应冒称为我独自发明的设计。</w:t>
       </w:r>
     </w:p>
     <w:p>

</xml_diff>